<commit_message>
fix: Word test report CJK fonts (eastAsia) to avoid tofu boxes
Made-with: Cursor
</commit_message>
<xml_diff>
--- a/docs/EchoMie-测试报告.docx
+++ b/docs/EchoMie-测试报告.docx
@@ -8,7 +8,7 @@
       </w:pPr>
       <w:r>
         <w:rPr>
-          <w:rFonts w:ascii="黑体" w:hAnsi="黑体" w:eastAsia="黑体"/>
+          <w:rFonts w:ascii="黑体" w:hAnsi="黑体" w:eastAsia="黑体" w:cs="黑体"/>
           <w:b/>
           <w:sz w:val="36"/>
         </w:rPr>
@@ -33,7 +33,7 @@
           <w:p>
             <w:r>
               <w:rPr>
-                <w:rFonts w:ascii="宋体" w:hAnsi="宋体" w:eastAsia="宋体"/>
+                <w:rFonts w:ascii="微软雅黑" w:hAnsi="微软雅黑" w:eastAsia="微软雅黑" w:cs="微软雅黑"/>
                 <w:sz w:val="20"/>
               </w:rPr>
               <w:t>项目</w:t>
@@ -47,7 +47,7 @@
           <w:p>
             <w:r>
               <w:rPr>
-                <w:rFonts w:ascii="宋体" w:hAnsi="宋体" w:eastAsia="宋体"/>
+                <w:rFonts w:ascii="微软雅黑" w:hAnsi="微软雅黑" w:eastAsia="微软雅黑" w:cs="微软雅黑"/>
                 <w:sz w:val="20"/>
               </w:rPr>
               <w:t>内容</w:t>
@@ -63,7 +63,7 @@
           <w:p>
             <w:r>
               <w:rPr>
-                <w:rFonts w:ascii="宋体" w:hAnsi="宋体" w:eastAsia="宋体"/>
+                <w:rFonts w:ascii="微软雅黑" w:hAnsi="微软雅黑" w:eastAsia="微软雅黑" w:cs="微软雅黑"/>
                 <w:sz w:val="18"/>
               </w:rPr>
               <w:t>系统名称</w:t>
@@ -77,7 +77,7 @@
           <w:p>
             <w:r>
               <w:rPr>
-                <w:rFonts w:ascii="宋体" w:hAnsi="宋体" w:eastAsia="宋体"/>
+                <w:rFonts w:ascii="微软雅黑" w:hAnsi="微软雅黑" w:eastAsia="微软雅黑" w:cs="微软雅黑"/>
                 <w:sz w:val="18"/>
               </w:rPr>
               <w:t>EchoMie（情绪记录与治愈类 Web 应用）</w:t>
@@ -93,7 +93,7 @@
           <w:p>
             <w:r>
               <w:rPr>
-                <w:rFonts w:ascii="宋体" w:hAnsi="宋体" w:eastAsia="宋体"/>
+                <w:rFonts w:ascii="微软雅黑" w:hAnsi="微软雅黑" w:eastAsia="微软雅黑" w:cs="微软雅黑"/>
                 <w:sz w:val="18"/>
               </w:rPr>
               <w:t>报告类型</w:t>
@@ -107,7 +107,7 @@
           <w:p>
             <w:r>
               <w:rPr>
-                <w:rFonts w:ascii="宋体" w:hAnsi="宋体" w:eastAsia="宋体"/>
+                <w:rFonts w:ascii="微软雅黑" w:hAnsi="微软雅黑" w:eastAsia="微软雅黑" w:cs="微软雅黑"/>
                 <w:sz w:val="18"/>
               </w:rPr>
               <w:t>功能与接口测试说明</w:t>
@@ -123,7 +123,7 @@
           <w:p>
             <w:r>
               <w:rPr>
-                <w:rFonts w:ascii="宋体" w:hAnsi="宋体" w:eastAsia="宋体"/>
+                <w:rFonts w:ascii="微软雅黑" w:hAnsi="微软雅黑" w:eastAsia="微软雅黑" w:cs="微软雅黑"/>
                 <w:sz w:val="18"/>
               </w:rPr>
               <w:t>版本说明</w:t>
@@ -137,7 +137,7 @@
           <w:p>
             <w:r>
               <w:rPr>
-                <w:rFonts w:ascii="宋体" w:hAnsi="宋体" w:eastAsia="宋体"/>
+                <w:rFonts w:ascii="微软雅黑" w:hAnsi="微软雅黑" w:eastAsia="微软雅黑" w:cs="微软雅黑"/>
                 <w:sz w:val="18"/>
               </w:rPr>
               <w:t>以当前 `main` 分支为准</w:t>
@@ -153,7 +153,7 @@
           <w:p>
             <w:r>
               <w:rPr>
-                <w:rFonts w:ascii="宋体" w:hAnsi="宋体" w:eastAsia="宋体"/>
+                <w:rFonts w:ascii="微软雅黑" w:hAnsi="微软雅黑" w:eastAsia="微软雅黑" w:cs="微软雅黑"/>
                 <w:sz w:val="18"/>
               </w:rPr>
               <w:t>编写说明</w:t>
@@ -167,7 +167,7 @@
           <w:p>
             <w:r>
               <w:rPr>
-                <w:rFonts w:ascii="宋体" w:hAnsi="宋体" w:eastAsia="宋体"/>
+                <w:rFonts w:ascii="微软雅黑" w:hAnsi="微软雅黑" w:eastAsia="微软雅黑" w:cs="微软雅黑"/>
                 <w:sz w:val="18"/>
               </w:rPr>
               <w:t>测试项与预期结果已列出，执行人可在「实测结果」栏填写</w:t>
@@ -182,6 +182,11 @@
         <w:pStyle w:val="Heading1"/>
       </w:pPr>
       <w:r>
+        <w:rPr>
+          <w:rFonts w:ascii="黑体" w:hAnsi="黑体" w:eastAsia="黑体" w:cs="黑体"/>
+          <w:b/>
+          <w:sz w:val="28"/>
+        </w:rPr>
         <w:t>1. 测试目的与范围</w:t>
       </w:r>
     </w:p>
@@ -190,11 +195,20 @@
         <w:pStyle w:val="Heading2"/>
       </w:pPr>
       <w:r>
+        <w:rPr>
+          <w:rFonts w:ascii="黑体" w:hAnsi="黑体" w:eastAsia="黑体" w:cs="黑体"/>
+          <w:b/>
+          <w:sz w:val="24"/>
+        </w:rPr>
         <w:t>1.1 测试目的</w:t>
       </w:r>
     </w:p>
     <w:p>
       <w:r>
+        <w:rPr>
+          <w:rFonts w:ascii="微软雅黑" w:hAnsi="微软雅黑" w:eastAsia="微软雅黑" w:cs="微软雅黑"/>
+          <w:sz w:val="21"/>
+        </w:rPr>
         <w:t>验证 EchoMie 在网页端（及与后端联调场景下）的核心能力是否可用：用户认证、媒体上传与异步处理、情绪卡片展示、周报、AI 对话、音乐列表、海报生成等。</w:t>
       </w:r>
     </w:p>
@@ -203,6 +217,11 @@
         <w:pStyle w:val="Heading2"/>
       </w:pPr>
       <w:r>
+        <w:rPr>
+          <w:rFonts w:ascii="黑体" w:hAnsi="黑体" w:eastAsia="黑体" w:cs="黑体"/>
+          <w:b/>
+          <w:sz w:val="24"/>
+        </w:rPr>
         <w:t>1.2 测试范围</w:t>
       </w:r>
     </w:p>
@@ -224,7 +243,7 @@
           <w:p>
             <w:r>
               <w:rPr>
-                <w:rFonts w:ascii="宋体" w:hAnsi="宋体" w:eastAsia="宋体"/>
+                <w:rFonts w:ascii="微软雅黑" w:hAnsi="微软雅黑" w:eastAsia="微软雅黑" w:cs="微软雅黑"/>
                 <w:sz w:val="20"/>
               </w:rPr>
               <w:t>包含</w:t>
@@ -238,7 +257,7 @@
           <w:p>
             <w:r>
               <w:rPr>
-                <w:rFonts w:ascii="宋体" w:hAnsi="宋体" w:eastAsia="宋体"/>
+                <w:rFonts w:ascii="微软雅黑" w:hAnsi="微软雅黑" w:eastAsia="微软雅黑" w:cs="微软雅黑"/>
                 <w:sz w:val="20"/>
               </w:rPr>
               <w:t>不包含（或需单独环境）</w:t>
@@ -254,7 +273,7 @@
           <w:p>
             <w:r>
               <w:rPr>
-                <w:rFonts w:ascii="宋体" w:hAnsi="宋体" w:eastAsia="宋体"/>
+                <w:rFonts w:ascii="微软雅黑" w:hAnsi="微软雅黑" w:eastAsia="微软雅黑" w:cs="微软雅黑"/>
                 <w:sz w:val="18"/>
               </w:rPr>
               <w:t>Web 前端主要页面与交互</w:t>
@@ -268,7 +287,7 @@
           <w:p>
             <w:r>
               <w:rPr>
-                <w:rFonts w:ascii="宋体" w:hAnsi="宋体" w:eastAsia="宋体"/>
+                <w:rFonts w:ascii="微软雅黑" w:hAnsi="微软雅黑" w:eastAsia="微软雅黑" w:cs="微软雅黑"/>
                 <w:sz w:val="18"/>
               </w:rPr>
               <w:t>微信小程序真机全量回归（需备案域名 + HTTPS）</w:t>
@@ -284,7 +303,7 @@
           <w:p>
             <w:r>
               <w:rPr>
-                <w:rFonts w:ascii="宋体" w:hAnsi="宋体" w:eastAsia="宋体"/>
+                <w:rFonts w:ascii="微软雅黑" w:hAnsi="微软雅黑" w:eastAsia="微软雅黑" w:cs="微软雅黑"/>
                 <w:sz w:val="18"/>
               </w:rPr>
               <w:t>后端 REST API 行为</w:t>
@@ -298,7 +317,7 @@
           <w:p>
             <w:r>
               <w:rPr>
-                <w:rFonts w:ascii="宋体" w:hAnsi="宋体" w:eastAsia="宋体"/>
+                <w:rFonts w:ascii="微软雅黑" w:hAnsi="微软雅黑" w:eastAsia="微软雅黑" w:cs="微软雅黑"/>
                 <w:sz w:val="18"/>
               </w:rPr>
               <w:t>第三方 DashScope / 微信接口 SLA 承诺</w:t>
@@ -314,7 +333,7 @@
           <w:p>
             <w:r>
               <w:rPr>
-                <w:rFonts w:ascii="宋体" w:hAnsi="宋体" w:eastAsia="宋体"/>
+                <w:rFonts w:ascii="微软雅黑" w:hAnsi="微软雅黑" w:eastAsia="微软雅黑" w:cs="微软雅黑"/>
                 <w:sz w:val="18"/>
               </w:rPr>
               <w:t>Docker 部署形态下的服务联通</w:t>
@@ -328,7 +347,7 @@
           <w:p>
             <w:r>
               <w:rPr>
-                <w:rFonts w:ascii="宋体" w:hAnsi="宋体" w:eastAsia="宋体"/>
+                <w:rFonts w:ascii="微软雅黑" w:hAnsi="微软雅黑" w:eastAsia="微软雅黑" w:cs="微软雅黑"/>
                 <w:sz w:val="18"/>
               </w:rPr>
               <w:t>压力测试与性能基线</w:t>
@@ -343,6 +362,11 @@
         <w:pStyle w:val="Heading1"/>
       </w:pPr>
       <w:r>
+        <w:rPr>
+          <w:rFonts w:ascii="黑体" w:hAnsi="黑体" w:eastAsia="黑体" w:cs="黑体"/>
+          <w:b/>
+          <w:sz w:val="28"/>
+        </w:rPr>
         <w:t>2. 测试环境</w:t>
       </w:r>
     </w:p>
@@ -364,7 +388,7 @@
           <w:p>
             <w:r>
               <w:rPr>
-                <w:rFonts w:ascii="宋体" w:hAnsi="宋体" w:eastAsia="宋体"/>
+                <w:rFonts w:ascii="微软雅黑" w:hAnsi="微软雅黑" w:eastAsia="微软雅黑" w:cs="微软雅黑"/>
                 <w:sz w:val="20"/>
               </w:rPr>
               <w:t>项</w:t>
@@ -378,7 +402,7 @@
           <w:p>
             <w:r>
               <w:rPr>
-                <w:rFonts w:ascii="宋体" w:hAnsi="宋体" w:eastAsia="宋体"/>
+                <w:rFonts w:ascii="微软雅黑" w:hAnsi="微软雅黑" w:eastAsia="微软雅黑" w:cs="微软雅黑"/>
                 <w:sz w:val="20"/>
               </w:rPr>
               <w:t>说明</w:t>
@@ -394,7 +418,7 @@
           <w:p>
             <w:r>
               <w:rPr>
-                <w:rFonts w:ascii="宋体" w:hAnsi="宋体" w:eastAsia="宋体"/>
+                <w:rFonts w:ascii="微软雅黑" w:hAnsi="微软雅黑" w:eastAsia="微软雅黑" w:cs="微软雅黑"/>
                 <w:sz w:val="18"/>
               </w:rPr>
               <w:t>客户端</w:t>
@@ -408,7 +432,7 @@
           <w:p>
             <w:r>
               <w:rPr>
-                <w:rFonts w:ascii="宋体" w:hAnsi="宋体" w:eastAsia="宋体"/>
+                <w:rFonts w:ascii="微软雅黑" w:hAnsi="微软雅黑" w:eastAsia="微软雅黑" w:cs="微软雅黑"/>
                 <w:sz w:val="18"/>
               </w:rPr>
               <w:t>Chrome / Edge 最新稳定版（建议）</w:t>
@@ -424,7 +448,7 @@
           <w:p>
             <w:r>
               <w:rPr>
-                <w:rFonts w:ascii="宋体" w:hAnsi="宋体" w:eastAsia="宋体"/>
+                <w:rFonts w:ascii="微软雅黑" w:hAnsi="微软雅黑" w:eastAsia="微软雅黑" w:cs="微软雅黑"/>
                 <w:sz w:val="18"/>
               </w:rPr>
               <w:t>访问地址</w:t>
@@ -438,7 +462,7 @@
           <w:p>
             <w:r>
               <w:rPr>
-                <w:rFonts w:ascii="宋体" w:hAnsi="宋体" w:eastAsia="宋体"/>
+                <w:rFonts w:ascii="微软雅黑" w:hAnsi="微软雅黑" w:eastAsia="微软雅黑" w:cs="微软雅黑"/>
                 <w:sz w:val="18"/>
               </w:rPr>
               <w:t>部署服务器公网 IP 或已绑定域名（示例：`http://&lt;服务器IP&gt;`）</w:t>
@@ -454,7 +478,7 @@
           <w:p>
             <w:r>
               <w:rPr>
-                <w:rFonts w:ascii="宋体" w:hAnsi="宋体" w:eastAsia="宋体"/>
+                <w:rFonts w:ascii="微软雅黑" w:hAnsi="微软雅黑" w:eastAsia="微软雅黑" w:cs="微软雅黑"/>
                 <w:sz w:val="18"/>
               </w:rPr>
               <w:t>后端</w:t>
@@ -468,7 +492,7 @@
           <w:p>
             <w:r>
               <w:rPr>
-                <w:rFonts w:ascii="宋体" w:hAnsi="宋体" w:eastAsia="宋体"/>
+                <w:rFonts w:ascii="微软雅黑" w:hAnsi="微软雅黑" w:eastAsia="微软雅黑" w:cs="微软雅黑"/>
                 <w:sz w:val="18"/>
               </w:rPr>
               <w:t>FastAPI + Gunicorn，PostgreSQL + Redis，Worker 队列</w:t>
@@ -484,7 +508,7 @@
           <w:p>
             <w:r>
               <w:rPr>
-                <w:rFonts w:ascii="宋体" w:hAnsi="宋体" w:eastAsia="宋体"/>
+                <w:rFonts w:ascii="微软雅黑" w:hAnsi="微软雅黑" w:eastAsia="微软雅黑" w:cs="微软雅黑"/>
                 <w:sz w:val="18"/>
               </w:rPr>
               <w:t>关键环境变量</w:t>
@@ -498,7 +522,7 @@
           <w:p>
             <w:r>
               <w:rPr>
-                <w:rFonts w:ascii="宋体" w:hAnsi="宋体" w:eastAsia="宋体"/>
+                <w:rFonts w:ascii="微软雅黑" w:hAnsi="微软雅黑" w:eastAsia="微软雅黑" w:cs="微软雅黑"/>
                 <w:sz w:val="18"/>
               </w:rPr>
               <w:t>`DASHSCOPE_API_KEY`（大模型）、`JWT_SECRET_KEY`、`DATABASE_URL`、`REDIS_URL`、`STORAGE_BASE_PATH` 等</w:t>
@@ -514,7 +538,7 @@
           <w:p>
             <w:r>
               <w:rPr>
-                <w:rFonts w:ascii="宋体" w:hAnsi="宋体" w:eastAsia="宋体"/>
+                <w:rFonts w:ascii="微软雅黑" w:hAnsi="微软雅黑" w:eastAsia="微软雅黑" w:cs="微软雅黑"/>
                 <w:sz w:val="18"/>
               </w:rPr>
               <w:t>网络</w:t>
@@ -528,7 +552,7 @@
           <w:p>
             <w:r>
               <w:rPr>
-                <w:rFonts w:ascii="宋体" w:hAnsi="宋体" w:eastAsia="宋体"/>
+                <w:rFonts w:ascii="微软雅黑" w:hAnsi="微软雅黑" w:eastAsia="微软雅黑" w:cs="微软雅黑"/>
                 <w:sz w:val="18"/>
               </w:rPr>
               <w:t>需能访问 DashScope；若使用微信登录需配置 `WX_APP_ID` / `WX_APP_SECRET`</w:t>
@@ -543,6 +567,11 @@
         <w:pStyle w:val="Heading1"/>
       </w:pPr>
       <w:r>
+        <w:rPr>
+          <w:rFonts w:ascii="黑体" w:hAnsi="黑体" w:eastAsia="黑体" w:cs="黑体"/>
+          <w:b/>
+          <w:sz w:val="28"/>
+        </w:rPr>
         <w:t>3. 测试用例</w:t>
       </w:r>
     </w:p>
@@ -551,6 +580,11 @@
         <w:pStyle w:val="Heading2"/>
       </w:pPr>
       <w:r>
+        <w:rPr>
+          <w:rFonts w:ascii="黑体" w:hAnsi="黑体" w:eastAsia="黑体" w:cs="黑体"/>
+          <w:b/>
+          <w:sz w:val="24"/>
+        </w:rPr>
         <w:t>3.1 用户与认证</w:t>
       </w:r>
     </w:p>
@@ -576,7 +610,7 @@
           <w:p>
             <w:r>
               <w:rPr>
-                <w:rFonts w:ascii="宋体" w:hAnsi="宋体" w:eastAsia="宋体"/>
+                <w:rFonts w:ascii="微软雅黑" w:hAnsi="微软雅黑" w:eastAsia="微软雅黑" w:cs="微软雅黑"/>
                 <w:sz w:val="20"/>
               </w:rPr>
               <w:t>编号</w:t>
@@ -590,7 +624,7 @@
           <w:p>
             <w:r>
               <w:rPr>
-                <w:rFonts w:ascii="宋体" w:hAnsi="宋体" w:eastAsia="宋体"/>
+                <w:rFonts w:ascii="微软雅黑" w:hAnsi="微软雅黑" w:eastAsia="微软雅黑" w:cs="微软雅黑"/>
                 <w:sz w:val="20"/>
               </w:rPr>
               <w:t>用例名称</w:t>
@@ -604,7 +638,7 @@
           <w:p>
             <w:r>
               <w:rPr>
-                <w:rFonts w:ascii="宋体" w:hAnsi="宋体" w:eastAsia="宋体"/>
+                <w:rFonts w:ascii="微软雅黑" w:hAnsi="微软雅黑" w:eastAsia="微软雅黑" w:cs="微软雅黑"/>
                 <w:sz w:val="20"/>
               </w:rPr>
               <w:t>前置条件</w:t>
@@ -618,7 +652,7 @@
           <w:p>
             <w:r>
               <w:rPr>
-                <w:rFonts w:ascii="宋体" w:hAnsi="宋体" w:eastAsia="宋体"/>
+                <w:rFonts w:ascii="微软雅黑" w:hAnsi="微软雅黑" w:eastAsia="微软雅黑" w:cs="微软雅黑"/>
                 <w:sz w:val="20"/>
               </w:rPr>
               <w:t>操作步骤</w:t>
@@ -632,7 +666,7 @@
           <w:p>
             <w:r>
               <w:rPr>
-                <w:rFonts w:ascii="宋体" w:hAnsi="宋体" w:eastAsia="宋体"/>
+                <w:rFonts w:ascii="微软雅黑" w:hAnsi="微软雅黑" w:eastAsia="微软雅黑" w:cs="微软雅黑"/>
                 <w:sz w:val="20"/>
               </w:rPr>
               <w:t>预期结果</w:t>
@@ -646,7 +680,7 @@
           <w:p>
             <w:r>
               <w:rPr>
-                <w:rFonts w:ascii="宋体" w:hAnsi="宋体" w:eastAsia="宋体"/>
+                <w:rFonts w:ascii="微软雅黑" w:hAnsi="微软雅黑" w:eastAsia="微软雅黑" w:cs="微软雅黑"/>
                 <w:sz w:val="20"/>
               </w:rPr>
               <w:t>实测结果</w:t>
@@ -662,7 +696,7 @@
           <w:p>
             <w:r>
               <w:rPr>
-                <w:rFonts w:ascii="宋体" w:hAnsi="宋体" w:eastAsia="宋体"/>
+                <w:rFonts w:ascii="微软雅黑" w:hAnsi="微软雅黑" w:eastAsia="微软雅黑" w:cs="微软雅黑"/>
                 <w:sz w:val="18"/>
               </w:rPr>
               <w:t>U-01</w:t>
@@ -676,7 +710,7 @@
           <w:p>
             <w:r>
               <w:rPr>
-                <w:rFonts w:ascii="宋体" w:hAnsi="宋体" w:eastAsia="宋体"/>
+                <w:rFonts w:ascii="微软雅黑" w:hAnsi="微软雅黑" w:eastAsia="微软雅黑" w:cs="微软雅黑"/>
                 <w:sz w:val="18"/>
               </w:rPr>
               <w:t>用户注册</w:t>
@@ -690,7 +724,7 @@
           <w:p>
             <w:r>
               <w:rPr>
-                <w:rFonts w:ascii="宋体" w:hAnsi="宋体" w:eastAsia="宋体"/>
+                <w:rFonts w:ascii="微软雅黑" w:hAnsi="微软雅黑" w:eastAsia="微软雅黑" w:cs="微软雅黑"/>
                 <w:sz w:val="18"/>
               </w:rPr>
               <w:t>无同邮箱账号</w:t>
@@ -704,7 +738,7 @@
           <w:p>
             <w:r>
               <w:rPr>
-                <w:rFonts w:ascii="宋体" w:hAnsi="宋体" w:eastAsia="宋体"/>
+                <w:rFonts w:ascii="微软雅黑" w:hAnsi="微软雅黑" w:eastAsia="微软雅黑" w:cs="微软雅黑"/>
                 <w:sz w:val="18"/>
               </w:rPr>
               <w:t>打开注册页，填写用户名、邮箱、密码并提交</w:t>
@@ -718,7 +752,7 @@
           <w:p>
             <w:r>
               <w:rPr>
-                <w:rFonts w:ascii="宋体" w:hAnsi="宋体" w:eastAsia="宋体"/>
+                <w:rFonts w:ascii="微软雅黑" w:hAnsi="微软雅黑" w:eastAsia="微软雅黑" w:cs="微软雅黑"/>
                 <w:sz w:val="18"/>
               </w:rPr>
               <w:t>注册成功并进入已登录态或跳转登录</w:t>
@@ -740,7 +774,7 @@
           <w:p>
             <w:r>
               <w:rPr>
-                <w:rFonts w:ascii="宋体" w:hAnsi="宋体" w:eastAsia="宋体"/>
+                <w:rFonts w:ascii="微软雅黑" w:hAnsi="微软雅黑" w:eastAsia="微软雅黑" w:cs="微软雅黑"/>
                 <w:sz w:val="18"/>
               </w:rPr>
               <w:t>U-02</w:t>
@@ -754,7 +788,7 @@
           <w:p>
             <w:r>
               <w:rPr>
-                <w:rFonts w:ascii="宋体" w:hAnsi="宋体" w:eastAsia="宋体"/>
+                <w:rFonts w:ascii="微软雅黑" w:hAnsi="微软雅黑" w:eastAsia="微软雅黑" w:cs="微软雅黑"/>
                 <w:sz w:val="18"/>
               </w:rPr>
               <w:t>用户登录</w:t>
@@ -768,7 +802,7 @@
           <w:p>
             <w:r>
               <w:rPr>
-                <w:rFonts w:ascii="宋体" w:hAnsi="宋体" w:eastAsia="宋体"/>
+                <w:rFonts w:ascii="微软雅黑" w:hAnsi="微软雅黑" w:eastAsia="微软雅黑" w:cs="微软雅黑"/>
                 <w:sz w:val="18"/>
               </w:rPr>
               <w:t>已有账号</w:t>
@@ -782,7 +816,7 @@
           <w:p>
             <w:r>
               <w:rPr>
-                <w:rFonts w:ascii="宋体" w:hAnsi="宋体" w:eastAsia="宋体"/>
+                <w:rFonts w:ascii="微软雅黑" w:hAnsi="微软雅黑" w:eastAsia="微软雅黑" w:cs="微软雅黑"/>
                 <w:sz w:val="18"/>
               </w:rPr>
               <w:t>输入账号密码登录</w:t>
@@ -796,7 +830,7 @@
           <w:p>
             <w:r>
               <w:rPr>
-                <w:rFonts w:ascii="宋体" w:hAnsi="宋体" w:eastAsia="宋体"/>
+                <w:rFonts w:ascii="微软雅黑" w:hAnsi="微软雅黑" w:eastAsia="微软雅黑" w:cs="微软雅黑"/>
                 <w:sz w:val="18"/>
               </w:rPr>
               <w:t>登录成功，可访问受保护页面</w:t>
@@ -818,7 +852,7 @@
           <w:p>
             <w:r>
               <w:rPr>
-                <w:rFonts w:ascii="宋体" w:hAnsi="宋体" w:eastAsia="宋体"/>
+                <w:rFonts w:ascii="微软雅黑" w:hAnsi="微软雅黑" w:eastAsia="微软雅黑" w:cs="微软雅黑"/>
                 <w:sz w:val="18"/>
               </w:rPr>
               <w:t>U-03</w:t>
@@ -832,7 +866,7 @@
           <w:p>
             <w:r>
               <w:rPr>
-                <w:rFonts w:ascii="宋体" w:hAnsi="宋体" w:eastAsia="宋体"/>
+                <w:rFonts w:ascii="微软雅黑" w:hAnsi="微软雅黑" w:eastAsia="微软雅黑" w:cs="微软雅黑"/>
                 <w:sz w:val="18"/>
               </w:rPr>
               <w:t>退出登录</w:t>
@@ -846,7 +880,7 @@
           <w:p>
             <w:r>
               <w:rPr>
-                <w:rFonts w:ascii="宋体" w:hAnsi="宋体" w:eastAsia="宋体"/>
+                <w:rFonts w:ascii="微软雅黑" w:hAnsi="微软雅黑" w:eastAsia="微软雅黑" w:cs="微软雅黑"/>
                 <w:sz w:val="18"/>
               </w:rPr>
               <w:t>已登录</w:t>
@@ -860,7 +894,7 @@
           <w:p>
             <w:r>
               <w:rPr>
-                <w:rFonts w:ascii="宋体" w:hAnsi="宋体" w:eastAsia="宋体"/>
+                <w:rFonts w:ascii="微软雅黑" w:hAnsi="微软雅黑" w:eastAsia="微软雅黑" w:cs="微软雅黑"/>
                 <w:sz w:val="18"/>
               </w:rPr>
               <w:t>点击退出</w:t>
@@ -874,7 +908,7 @@
           <w:p>
             <w:r>
               <w:rPr>
-                <w:rFonts w:ascii="宋体" w:hAnsi="宋体" w:eastAsia="宋体"/>
+                <w:rFonts w:ascii="微软雅黑" w:hAnsi="微软雅黑" w:eastAsia="微软雅黑" w:cs="微软雅黑"/>
                 <w:sz w:val="18"/>
               </w:rPr>
               <w:t>Token 清除，跳转登录或首页策略符合设计</w:t>
@@ -896,7 +930,7 @@
           <w:p>
             <w:r>
               <w:rPr>
-                <w:rFonts w:ascii="宋体" w:hAnsi="宋体" w:eastAsia="宋体"/>
+                <w:rFonts w:ascii="微软雅黑" w:hAnsi="微软雅黑" w:eastAsia="微软雅黑" w:cs="微软雅黑"/>
                 <w:sz w:val="18"/>
               </w:rPr>
               <w:t>U-04</w:t>
@@ -910,7 +944,7 @@
           <w:p>
             <w:r>
               <w:rPr>
-                <w:rFonts w:ascii="宋体" w:hAnsi="宋体" w:eastAsia="宋体"/>
+                <w:rFonts w:ascii="微软雅黑" w:hAnsi="微软雅黑" w:eastAsia="微软雅黑" w:cs="微软雅黑"/>
                 <w:sz w:val="18"/>
               </w:rPr>
               <w:t>获取当前用户</w:t>
@@ -924,7 +958,7 @@
           <w:p>
             <w:r>
               <w:rPr>
-                <w:rFonts w:ascii="宋体" w:hAnsi="宋体" w:eastAsia="宋体"/>
+                <w:rFonts w:ascii="微软雅黑" w:hAnsi="微软雅黑" w:eastAsia="微软雅黑" w:cs="微软雅黑"/>
                 <w:sz w:val="18"/>
               </w:rPr>
               <w:t>已登录</w:t>
@@ -938,7 +972,7 @@
           <w:p>
             <w:r>
               <w:rPr>
-                <w:rFonts w:ascii="宋体" w:hAnsi="宋体" w:eastAsia="宋体"/>
+                <w:rFonts w:ascii="微软雅黑" w:hAnsi="微软雅黑" w:eastAsia="微软雅黑" w:cs="微软雅黑"/>
                 <w:sz w:val="18"/>
               </w:rPr>
               <w:t>打开个人中心或首页</w:t>
@@ -952,7 +986,7 @@
           <w:p>
             <w:r>
               <w:rPr>
-                <w:rFonts w:ascii="宋体" w:hAnsi="宋体" w:eastAsia="宋体"/>
+                <w:rFonts w:ascii="微软雅黑" w:hAnsi="微软雅黑" w:eastAsia="微软雅黑" w:cs="微软雅黑"/>
                 <w:sz w:val="18"/>
               </w:rPr>
               <w:t>显示用户名、头像表情等</w:t>
@@ -973,6 +1007,11 @@
         <w:pStyle w:val="Heading2"/>
       </w:pPr>
       <w:r>
+        <w:rPr>
+          <w:rFonts w:ascii="黑体" w:hAnsi="黑体" w:eastAsia="黑体" w:cs="黑体"/>
+          <w:b/>
+          <w:sz w:val="24"/>
+        </w:rPr>
         <w:t>3.2 记录与上传（情绪 + 可选卡通风格）</w:t>
       </w:r>
     </w:p>
@@ -998,7 +1037,7 @@
           <w:p>
             <w:r>
               <w:rPr>
-                <w:rFonts w:ascii="宋体" w:hAnsi="宋体" w:eastAsia="宋体"/>
+                <w:rFonts w:ascii="微软雅黑" w:hAnsi="微软雅黑" w:eastAsia="微软雅黑" w:cs="微软雅黑"/>
                 <w:sz w:val="20"/>
               </w:rPr>
               <w:t>编号</w:t>
@@ -1012,7 +1051,7 @@
           <w:p>
             <w:r>
               <w:rPr>
-                <w:rFonts w:ascii="宋体" w:hAnsi="宋体" w:eastAsia="宋体"/>
+                <w:rFonts w:ascii="微软雅黑" w:hAnsi="微软雅黑" w:eastAsia="微软雅黑" w:cs="微软雅黑"/>
                 <w:sz w:val="20"/>
               </w:rPr>
               <w:t>用例名称</w:t>
@@ -1026,7 +1065,7 @@
           <w:p>
             <w:r>
               <w:rPr>
-                <w:rFonts w:ascii="宋体" w:hAnsi="宋体" w:eastAsia="宋体"/>
+                <w:rFonts w:ascii="微软雅黑" w:hAnsi="微软雅黑" w:eastAsia="微软雅黑" w:cs="微软雅黑"/>
                 <w:sz w:val="20"/>
               </w:rPr>
               <w:t>前置条件</w:t>
@@ -1040,7 +1079,7 @@
           <w:p>
             <w:r>
               <w:rPr>
-                <w:rFonts w:ascii="宋体" w:hAnsi="宋体" w:eastAsia="宋体"/>
+                <w:rFonts w:ascii="微软雅黑" w:hAnsi="微软雅黑" w:eastAsia="微软雅黑" w:cs="微软雅黑"/>
                 <w:sz w:val="20"/>
               </w:rPr>
               <w:t>操作步骤</w:t>
@@ -1054,7 +1093,7 @@
           <w:p>
             <w:r>
               <w:rPr>
-                <w:rFonts w:ascii="宋体" w:hAnsi="宋体" w:eastAsia="宋体"/>
+                <w:rFonts w:ascii="微软雅黑" w:hAnsi="微软雅黑" w:eastAsia="微软雅黑" w:cs="微软雅黑"/>
                 <w:sz w:val="20"/>
               </w:rPr>
               <w:t>预期结果</w:t>
@@ -1068,7 +1107,7 @@
           <w:p>
             <w:r>
               <w:rPr>
-                <w:rFonts w:ascii="宋体" w:hAnsi="宋体" w:eastAsia="宋体"/>
+                <w:rFonts w:ascii="微软雅黑" w:hAnsi="微软雅黑" w:eastAsia="微软雅黑" w:cs="微软雅黑"/>
                 <w:sz w:val="20"/>
               </w:rPr>
               <w:t>实测结果</w:t>
@@ -1084,7 +1123,7 @@
           <w:p>
             <w:r>
               <w:rPr>
-                <w:rFonts w:ascii="宋体" w:hAnsi="宋体" w:eastAsia="宋体"/>
+                <w:rFonts w:ascii="微软雅黑" w:hAnsi="微软雅黑" w:eastAsia="微软雅黑" w:cs="微软雅黑"/>
                 <w:sz w:val="18"/>
               </w:rPr>
               <w:t>R-01</w:t>
@@ -1098,7 +1137,7 @@
           <w:p>
             <w:r>
               <w:rPr>
-                <w:rFonts w:ascii="宋体" w:hAnsi="宋体" w:eastAsia="宋体"/>
+                <w:rFonts w:ascii="微软雅黑" w:hAnsi="微软雅黑" w:eastAsia="微软雅黑" w:cs="微软雅黑"/>
                 <w:sz w:val="18"/>
               </w:rPr>
               <w:t>上传图片</w:t>
@@ -1112,7 +1151,7 @@
           <w:p>
             <w:r>
               <w:rPr>
-                <w:rFonts w:ascii="宋体" w:hAnsi="宋体" w:eastAsia="宋体"/>
+                <w:rFonts w:ascii="微软雅黑" w:hAnsi="微软雅黑" w:eastAsia="微软雅黑" w:cs="微软雅黑"/>
                 <w:sz w:val="18"/>
               </w:rPr>
               <w:t>已登录</w:t>
@@ -1126,7 +1165,7 @@
           <w:p>
             <w:r>
               <w:rPr>
-                <w:rFonts w:ascii="宋体" w:hAnsi="宋体" w:eastAsia="宋体"/>
+                <w:rFonts w:ascii="微软雅黑" w:hAnsi="微软雅黑" w:eastAsia="微软雅黑" w:cs="微软雅黑"/>
                 <w:sz w:val="18"/>
               </w:rPr>
               <w:t>记录页选择图片、可选文案与风格，提交</w:t>
@@ -1140,7 +1179,7 @@
           <w:p>
             <w:r>
               <w:rPr>
-                <w:rFonts w:ascii="宋体" w:hAnsi="宋体" w:eastAsia="宋体"/>
+                <w:rFonts w:ascii="微软雅黑" w:hAnsi="微软雅黑" w:eastAsia="微软雅黑" w:cs="微软雅黑"/>
                 <w:sz w:val="18"/>
               </w:rPr>
               <w:t>返回 `task_id`，进入排队或处理中</w:t>
@@ -1162,7 +1201,7 @@
           <w:p>
             <w:r>
               <w:rPr>
-                <w:rFonts w:ascii="宋体" w:hAnsi="宋体" w:eastAsia="宋体"/>
+                <w:rFonts w:ascii="微软雅黑" w:hAnsi="微软雅黑" w:eastAsia="微软雅黑" w:cs="微软雅黑"/>
                 <w:sz w:val="18"/>
               </w:rPr>
               <w:t>R-02</w:t>
@@ -1176,7 +1215,7 @@
           <w:p>
             <w:r>
               <w:rPr>
-                <w:rFonts w:ascii="宋体" w:hAnsi="宋体" w:eastAsia="宋体"/>
+                <w:rFonts w:ascii="微软雅黑" w:hAnsi="微软雅黑" w:eastAsia="微软雅黑" w:cs="微软雅黑"/>
                 <w:sz w:val="18"/>
               </w:rPr>
               <w:t>上传视频</w:t>
@@ -1190,7 +1229,7 @@
           <w:p>
             <w:r>
               <w:rPr>
-                <w:rFonts w:ascii="宋体" w:hAnsi="宋体" w:eastAsia="宋体"/>
+                <w:rFonts w:ascii="微软雅黑" w:hAnsi="微软雅黑" w:eastAsia="微软雅黑" w:cs="微软雅黑"/>
                 <w:sz w:val="18"/>
               </w:rPr>
               <w:t>已登录</w:t>
@@ -1204,7 +1243,7 @@
           <w:p>
             <w:r>
               <w:rPr>
-                <w:rFonts w:ascii="宋体" w:hAnsi="宋体" w:eastAsia="宋体"/>
+                <w:rFonts w:ascii="微软雅黑" w:hAnsi="微软雅黑" w:eastAsia="微软雅黑" w:cs="微软雅黑"/>
                 <w:sz w:val="18"/>
               </w:rPr>
               <w:t>选择短视频上传</w:t>
@@ -1218,7 +1257,7 @@
           <w:p>
             <w:r>
               <w:rPr>
-                <w:rFonts w:ascii="宋体" w:hAnsi="宋体" w:eastAsia="宋体"/>
+                <w:rFonts w:ascii="微软雅黑" w:hAnsi="微软雅黑" w:eastAsia="微软雅黑" w:cs="微软雅黑"/>
                 <w:sz w:val="18"/>
               </w:rPr>
               <w:t>任务创建成功，后续可查看进度与结果</w:t>
@@ -1240,7 +1279,7 @@
           <w:p>
             <w:r>
               <w:rPr>
-                <w:rFonts w:ascii="宋体" w:hAnsi="宋体" w:eastAsia="宋体"/>
+                <w:rFonts w:ascii="微软雅黑" w:hAnsi="微软雅黑" w:eastAsia="微软雅黑" w:cs="微软雅黑"/>
                 <w:sz w:val="18"/>
               </w:rPr>
               <w:t>R-03</w:t>
@@ -1254,7 +1293,7 @@
           <w:p>
             <w:r>
               <w:rPr>
-                <w:rFonts w:ascii="宋体" w:hAnsi="宋体" w:eastAsia="宋体"/>
+                <w:rFonts w:ascii="微软雅黑" w:hAnsi="微软雅黑" w:eastAsia="微软雅黑" w:cs="微软雅黑"/>
                 <w:sz w:val="18"/>
               </w:rPr>
               <w:t>风格「不处理」</w:t>
@@ -1268,7 +1307,7 @@
           <w:p>
             <w:r>
               <w:rPr>
-                <w:rFonts w:ascii="宋体" w:hAnsi="宋体" w:eastAsia="宋体"/>
+                <w:rFonts w:ascii="微软雅黑" w:hAnsi="微软雅黑" w:eastAsia="微软雅黑" w:cs="微软雅黑"/>
                 <w:sz w:val="18"/>
               </w:rPr>
               <w:t>已登录</w:t>
@@ -1282,7 +1321,7 @@
           <w:p>
             <w:r>
               <w:rPr>
-                <w:rFonts w:ascii="宋体" w:hAnsi="宋体" w:eastAsia="宋体"/>
+                <w:rFonts w:ascii="微软雅黑" w:hAnsi="微软雅黑" w:eastAsia="微软雅黑" w:cs="微软雅黑"/>
                 <w:sz w:val="18"/>
               </w:rPr>
               <w:t>选择「不处理」仅分析</w:t>
@@ -1296,7 +1335,7 @@
           <w:p>
             <w:r>
               <w:rPr>
-                <w:rFonts w:ascii="宋体" w:hAnsi="宋体" w:eastAsia="宋体"/>
+                <w:rFonts w:ascii="微软雅黑" w:hAnsi="微软雅黑" w:eastAsia="微软雅黑" w:cs="微软雅黑"/>
                 <w:sz w:val="18"/>
               </w:rPr>
               <w:t>完成后有情绪文案，输出可与原图一致或仅分析路径</w:t>
@@ -1318,7 +1357,7 @@
           <w:p>
             <w:r>
               <w:rPr>
-                <w:rFonts w:ascii="宋体" w:hAnsi="宋体" w:eastAsia="宋体"/>
+                <w:rFonts w:ascii="微软雅黑" w:hAnsi="微软雅黑" w:eastAsia="微软雅黑" w:cs="微软雅黑"/>
                 <w:sz w:val="18"/>
               </w:rPr>
               <w:t>R-04</w:t>
@@ -1332,7 +1371,7 @@
           <w:p>
             <w:r>
               <w:rPr>
-                <w:rFonts w:ascii="宋体" w:hAnsi="宋体" w:eastAsia="宋体"/>
+                <w:rFonts w:ascii="微软雅黑" w:hAnsi="微软雅黑" w:eastAsia="微软雅黑" w:cs="微软雅黑"/>
                 <w:sz w:val="18"/>
               </w:rPr>
               <w:t>风格化效果</w:t>
@@ -1346,7 +1385,7 @@
           <w:p>
             <w:r>
               <w:rPr>
-                <w:rFonts w:ascii="宋体" w:hAnsi="宋体" w:eastAsia="宋体"/>
+                <w:rFonts w:ascii="微软雅黑" w:hAnsi="微软雅黑" w:eastAsia="微软雅黑" w:cs="微软雅黑"/>
                 <w:sz w:val="18"/>
               </w:rPr>
               <w:t>已登录</w:t>
@@ -1360,7 +1399,7 @@
           <w:p>
             <w:r>
               <w:rPr>
-                <w:rFonts w:ascii="宋体" w:hAnsi="宋体" w:eastAsia="宋体"/>
+                <w:rFonts w:ascii="微软雅黑" w:hAnsi="微软雅黑" w:eastAsia="微软雅黑" w:cs="微软雅黑"/>
                 <w:sz w:val="18"/>
               </w:rPr>
               <w:t>选择任一卡通风格</w:t>
@@ -1374,7 +1413,7 @@
           <w:p>
             <w:r>
               <w:rPr>
-                <w:rFonts w:ascii="宋体" w:hAnsi="宋体" w:eastAsia="宋体"/>
+                <w:rFonts w:ascii="微软雅黑" w:hAnsi="微软雅黑" w:eastAsia="微软雅黑" w:cs="微软雅黑"/>
                 <w:sz w:val="18"/>
               </w:rPr>
               <w:t>完成后可切换原图 / 风格化对比</w:t>
@@ -1395,6 +1434,11 @@
         <w:pStyle w:val="Heading2"/>
       </w:pPr>
       <w:r>
+        <w:rPr>
+          <w:rFonts w:ascii="黑体" w:hAnsi="黑体" w:eastAsia="黑体" w:cs="黑体"/>
+          <w:b/>
+          <w:sz w:val="24"/>
+        </w:rPr>
         <w:t>3.3 任务与情绪卡片</w:t>
       </w:r>
     </w:p>
@@ -1420,7 +1464,7 @@
           <w:p>
             <w:r>
               <w:rPr>
-                <w:rFonts w:ascii="宋体" w:hAnsi="宋体" w:eastAsia="宋体"/>
+                <w:rFonts w:ascii="微软雅黑" w:hAnsi="微软雅黑" w:eastAsia="微软雅黑" w:cs="微软雅黑"/>
                 <w:sz w:val="20"/>
               </w:rPr>
               <w:t>编号</w:t>
@@ -1434,7 +1478,7 @@
           <w:p>
             <w:r>
               <w:rPr>
-                <w:rFonts w:ascii="宋体" w:hAnsi="宋体" w:eastAsia="宋体"/>
+                <w:rFonts w:ascii="微软雅黑" w:hAnsi="微软雅黑" w:eastAsia="微软雅黑" w:cs="微软雅黑"/>
                 <w:sz w:val="20"/>
               </w:rPr>
               <w:t>用例名称</w:t>
@@ -1448,7 +1492,7 @@
           <w:p>
             <w:r>
               <w:rPr>
-                <w:rFonts w:ascii="宋体" w:hAnsi="宋体" w:eastAsia="宋体"/>
+                <w:rFonts w:ascii="微软雅黑" w:hAnsi="微软雅黑" w:eastAsia="微软雅黑" w:cs="微软雅黑"/>
                 <w:sz w:val="20"/>
               </w:rPr>
               <w:t>前置条件</w:t>
@@ -1462,7 +1506,7 @@
           <w:p>
             <w:r>
               <w:rPr>
-                <w:rFonts w:ascii="宋体" w:hAnsi="宋体" w:eastAsia="宋体"/>
+                <w:rFonts w:ascii="微软雅黑" w:hAnsi="微软雅黑" w:eastAsia="微软雅黑" w:cs="微软雅黑"/>
                 <w:sz w:val="20"/>
               </w:rPr>
               <w:t>操作步骤</w:t>
@@ -1476,7 +1520,7 @@
           <w:p>
             <w:r>
               <w:rPr>
-                <w:rFonts w:ascii="宋体" w:hAnsi="宋体" w:eastAsia="宋体"/>
+                <w:rFonts w:ascii="微软雅黑" w:hAnsi="微软雅黑" w:eastAsia="微软雅黑" w:cs="微软雅黑"/>
                 <w:sz w:val="20"/>
               </w:rPr>
               <w:t>预期结果</w:t>
@@ -1490,7 +1534,7 @@
           <w:p>
             <w:r>
               <w:rPr>
-                <w:rFonts w:ascii="宋体" w:hAnsi="宋体" w:eastAsia="宋体"/>
+                <w:rFonts w:ascii="微软雅黑" w:hAnsi="微软雅黑" w:eastAsia="微软雅黑" w:cs="微软雅黑"/>
                 <w:sz w:val="20"/>
               </w:rPr>
               <w:t>实测结果</w:t>
@@ -1506,7 +1550,7 @@
           <w:p>
             <w:r>
               <w:rPr>
-                <w:rFonts w:ascii="宋体" w:hAnsi="宋体" w:eastAsia="宋体"/>
+                <w:rFonts w:ascii="微软雅黑" w:hAnsi="微软雅黑" w:eastAsia="微软雅黑" w:cs="微软雅黑"/>
                 <w:sz w:val="18"/>
               </w:rPr>
               <w:t>T-01</w:t>
@@ -1520,7 +1564,7 @@
           <w:p>
             <w:r>
               <w:rPr>
-                <w:rFonts w:ascii="宋体" w:hAnsi="宋体" w:eastAsia="宋体"/>
+                <w:rFonts w:ascii="微软雅黑" w:hAnsi="微软雅黑" w:eastAsia="微软雅黑" w:cs="微软雅黑"/>
                 <w:sz w:val="18"/>
               </w:rPr>
               <w:t>任务列表 / 时间轴</w:t>
@@ -1534,7 +1578,7 @@
           <w:p>
             <w:r>
               <w:rPr>
-                <w:rFonts w:ascii="宋体" w:hAnsi="宋体" w:eastAsia="宋体"/>
+                <w:rFonts w:ascii="微软雅黑" w:hAnsi="微软雅黑" w:eastAsia="微软雅黑" w:cs="微软雅黑"/>
                 <w:sz w:val="18"/>
               </w:rPr>
               <w:t>已有完成任务</w:t>
@@ -1548,7 +1592,7 @@
           <w:p>
             <w:r>
               <w:rPr>
-                <w:rFonts w:ascii="宋体" w:hAnsi="宋体" w:eastAsia="宋体"/>
+                <w:rFonts w:ascii="微软雅黑" w:hAnsi="微软雅黑" w:eastAsia="微软雅黑" w:cs="微软雅黑"/>
                 <w:sz w:val="18"/>
               </w:rPr>
               <w:t>打开时间轴</w:t>
@@ -1562,7 +1606,7 @@
           <w:p>
             <w:r>
               <w:rPr>
-                <w:rFonts w:ascii="宋体" w:hAnsi="宋体" w:eastAsia="宋体"/>
+                <w:rFonts w:ascii="微软雅黑" w:hAnsi="微软雅黑" w:eastAsia="微软雅黑" w:cs="微软雅黑"/>
                 <w:sz w:val="18"/>
               </w:rPr>
               <w:t>列表展示缩略图、标题、情绪等</w:t>
@@ -1584,7 +1628,7 @@
           <w:p>
             <w:r>
               <w:rPr>
-                <w:rFonts w:ascii="宋体" w:hAnsi="宋体" w:eastAsia="宋体"/>
+                <w:rFonts w:ascii="微软雅黑" w:hAnsi="微软雅黑" w:eastAsia="微软雅黑" w:cs="微软雅黑"/>
                 <w:sz w:val="18"/>
               </w:rPr>
               <w:t>T-02</w:t>
@@ -1598,7 +1642,7 @@
           <w:p>
             <w:r>
               <w:rPr>
-                <w:rFonts w:ascii="宋体" w:hAnsi="宋体" w:eastAsia="宋体"/>
+                <w:rFonts w:ascii="微软雅黑" w:hAnsi="微软雅黑" w:eastAsia="微软雅黑" w:cs="微软雅黑"/>
                 <w:sz w:val="18"/>
               </w:rPr>
               <w:t>查看结果（卡片页）</w:t>
@@ -1612,7 +1656,7 @@
           <w:p>
             <w:r>
               <w:rPr>
-                <w:rFonts w:ascii="宋体" w:hAnsi="宋体" w:eastAsia="宋体"/>
+                <w:rFonts w:ascii="微软雅黑" w:hAnsi="微软雅黑" w:eastAsia="微软雅黑" w:cs="微软雅黑"/>
                 <w:sz w:val="18"/>
               </w:rPr>
               <w:t>任务已完成</w:t>
@@ -1626,7 +1670,7 @@
           <w:p>
             <w:r>
               <w:rPr>
-                <w:rFonts w:ascii="宋体" w:hAnsi="宋体" w:eastAsia="宋体"/>
+                <w:rFonts w:ascii="微软雅黑" w:hAnsi="微软雅黑" w:eastAsia="微软雅黑" w:cs="微软雅黑"/>
                 <w:sz w:val="18"/>
               </w:rPr>
               <w:t>点击某条进入卡片详情</w:t>
@@ -1640,7 +1684,7 @@
           <w:p>
             <w:r>
               <w:rPr>
-                <w:rFonts w:ascii="宋体" w:hAnsi="宋体" w:eastAsia="宋体"/>
+                <w:rFonts w:ascii="微软雅黑" w:hAnsi="微软雅黑" w:eastAsia="微软雅黑" w:cs="微软雅黑"/>
                 <w:sz w:val="18"/>
               </w:rPr>
               <w:t>正常展示媒体、标题、治愈文案、标签、语音（若有）</w:t>
@@ -1662,7 +1706,7 @@
           <w:p>
             <w:r>
               <w:rPr>
-                <w:rFonts w:ascii="宋体" w:hAnsi="宋体" w:eastAsia="宋体"/>
+                <w:rFonts w:ascii="微软雅黑" w:hAnsi="微软雅黑" w:eastAsia="微软雅黑" w:cs="微软雅黑"/>
                 <w:sz w:val="18"/>
               </w:rPr>
               <w:t>T-03</w:t>
@@ -1676,7 +1720,7 @@
           <w:p>
             <w:r>
               <w:rPr>
-                <w:rFonts w:ascii="宋体" w:hAnsi="宋体" w:eastAsia="宋体"/>
+                <w:rFonts w:ascii="微软雅黑" w:hAnsi="微软雅黑" w:eastAsia="微软雅黑" w:cs="微软雅黑"/>
                 <w:sz w:val="18"/>
               </w:rPr>
               <w:t>处理中轮询</w:t>
@@ -1690,7 +1734,7 @@
           <w:p>
             <w:r>
               <w:rPr>
-                <w:rFonts w:ascii="宋体" w:hAnsi="宋体" w:eastAsia="宋体"/>
+                <w:rFonts w:ascii="微软雅黑" w:hAnsi="微软雅黑" w:eastAsia="微软雅黑" w:cs="微软雅黑"/>
                 <w:sz w:val="18"/>
               </w:rPr>
               <w:t>任务处理中</w:t>
@@ -1704,7 +1748,7 @@
           <w:p>
             <w:r>
               <w:rPr>
-                <w:rFonts w:ascii="宋体" w:hAnsi="宋体" w:eastAsia="宋体"/>
+                <w:rFonts w:ascii="微软雅黑" w:hAnsi="微软雅黑" w:eastAsia="微软雅黑" w:cs="微软雅黑"/>
                 <w:sz w:val="18"/>
               </w:rPr>
               <w:t>停留在卡片页</w:t>
@@ -1718,7 +1762,7 @@
           <w:p>
             <w:r>
               <w:rPr>
-                <w:rFonts w:ascii="宋体" w:hAnsi="宋体" w:eastAsia="宋体"/>
+                <w:rFonts w:ascii="微软雅黑" w:hAnsi="微软雅黑" w:eastAsia="微软雅黑" w:cs="微软雅黑"/>
                 <w:sz w:val="18"/>
               </w:rPr>
               <w:t>进度条更新，完成后自动展示结果</w:t>
@@ -1740,7 +1784,7 @@
           <w:p>
             <w:r>
               <w:rPr>
-                <w:rFonts w:ascii="宋体" w:hAnsi="宋体" w:eastAsia="宋体"/>
+                <w:rFonts w:ascii="微软雅黑" w:hAnsi="微软雅黑" w:eastAsia="微软雅黑" w:cs="微软雅黑"/>
                 <w:sz w:val="18"/>
               </w:rPr>
               <w:t>T-04</w:t>
@@ -1754,7 +1798,7 @@
           <w:p>
             <w:r>
               <w:rPr>
-                <w:rFonts w:ascii="宋体" w:hAnsi="宋体" w:eastAsia="宋体"/>
+                <w:rFonts w:ascii="微软雅黑" w:hAnsi="微软雅黑" w:eastAsia="微软雅黑" w:cs="微软雅黑"/>
                 <w:sz w:val="18"/>
               </w:rPr>
               <w:t>失败任务</w:t>
@@ -1768,7 +1812,7 @@
           <w:p>
             <w:r>
               <w:rPr>
-                <w:rFonts w:ascii="宋体" w:hAnsi="宋体" w:eastAsia="宋体"/>
+                <w:rFonts w:ascii="微软雅黑" w:hAnsi="微软雅黑" w:eastAsia="微软雅黑" w:cs="微软雅黑"/>
                 <w:sz w:val="18"/>
               </w:rPr>
               <w:t>存在失败任务</w:t>
@@ -1782,7 +1826,7 @@
           <w:p>
             <w:r>
               <w:rPr>
-                <w:rFonts w:ascii="宋体" w:hAnsi="宋体" w:eastAsia="宋体"/>
+                <w:rFonts w:ascii="微软雅黑" w:hAnsi="微软雅黑" w:eastAsia="微软雅黑" w:cs="微软雅黑"/>
                 <w:sz w:val="18"/>
               </w:rPr>
               <w:t>打开对应卡片</w:t>
@@ -1796,7 +1840,7 @@
           <w:p>
             <w:r>
               <w:rPr>
-                <w:rFonts w:ascii="宋体" w:hAnsi="宋体" w:eastAsia="宋体"/>
+                <w:rFonts w:ascii="微软雅黑" w:hAnsi="微软雅黑" w:eastAsia="微软雅黑" w:cs="微软雅黑"/>
                 <w:sz w:val="18"/>
               </w:rPr>
               <w:t>显示错误信息，不白屏</w:t>
@@ -1818,7 +1862,7 @@
           <w:p>
             <w:r>
               <w:rPr>
-                <w:rFonts w:ascii="宋体" w:hAnsi="宋体" w:eastAsia="宋体"/>
+                <w:rFonts w:ascii="微软雅黑" w:hAnsi="微软雅黑" w:eastAsia="微软雅黑" w:cs="微软雅黑"/>
                 <w:sz w:val="18"/>
               </w:rPr>
               <w:t>T-05</w:t>
@@ -1832,7 +1876,7 @@
           <w:p>
             <w:r>
               <w:rPr>
-                <w:rFonts w:ascii="宋体" w:hAnsi="宋体" w:eastAsia="宋体"/>
+                <w:rFonts w:ascii="微软雅黑" w:hAnsi="微软雅黑" w:eastAsia="微软雅黑" w:cs="微软雅黑"/>
                 <w:sz w:val="18"/>
               </w:rPr>
               <w:t>下载风格化 / 原图</w:t>
@@ -1846,7 +1890,7 @@
           <w:p>
             <w:r>
               <w:rPr>
-                <w:rFonts w:ascii="宋体" w:hAnsi="宋体" w:eastAsia="宋体"/>
+                <w:rFonts w:ascii="微软雅黑" w:hAnsi="微软雅黑" w:eastAsia="微软雅黑" w:cs="微软雅黑"/>
                 <w:sz w:val="18"/>
               </w:rPr>
               <w:t>任务已完成</w:t>
@@ -1860,7 +1904,7 @@
           <w:p>
             <w:r>
               <w:rPr>
-                <w:rFonts w:ascii="宋体" w:hAnsi="宋体" w:eastAsia="宋体"/>
+                <w:rFonts w:ascii="微软雅黑" w:hAnsi="微软雅黑" w:eastAsia="微软雅黑" w:cs="微软雅黑"/>
                 <w:sz w:val="18"/>
               </w:rPr>
               <w:t>点击下载按钮</w:t>
@@ -1874,7 +1918,7 @@
           <w:p>
             <w:r>
               <w:rPr>
-                <w:rFonts w:ascii="宋体" w:hAnsi="宋体" w:eastAsia="宋体"/>
+                <w:rFonts w:ascii="微软雅黑" w:hAnsi="微软雅黑" w:eastAsia="微软雅黑" w:cs="微软雅黑"/>
                 <w:sz w:val="18"/>
               </w:rPr>
               <w:t>触发浏览器下载或等价行为</w:t>
@@ -1896,7 +1940,7 @@
           <w:p>
             <w:r>
               <w:rPr>
-                <w:rFonts w:ascii="宋体" w:hAnsi="宋体" w:eastAsia="宋体"/>
+                <w:rFonts w:ascii="微软雅黑" w:hAnsi="微软雅黑" w:eastAsia="微软雅黑" w:cs="微软雅黑"/>
                 <w:sz w:val="18"/>
               </w:rPr>
               <w:t>T-06</w:t>
@@ -1910,7 +1954,7 @@
           <w:p>
             <w:r>
               <w:rPr>
-                <w:rFonts w:ascii="宋体" w:hAnsi="宋体" w:eastAsia="宋体"/>
+                <w:rFonts w:ascii="微软雅黑" w:hAnsi="微软雅黑" w:eastAsia="微软雅黑" w:cs="微软雅黑"/>
                 <w:sz w:val="18"/>
               </w:rPr>
               <w:t>复制文案</w:t>
@@ -1924,7 +1968,7 @@
           <w:p>
             <w:r>
               <w:rPr>
-                <w:rFonts w:ascii="宋体" w:hAnsi="宋体" w:eastAsia="宋体"/>
+                <w:rFonts w:ascii="微软雅黑" w:hAnsi="微软雅黑" w:eastAsia="微软雅黑" w:cs="微软雅黑"/>
                 <w:sz w:val="18"/>
               </w:rPr>
               <w:t>有生成文案</w:t>
@@ -1938,7 +1982,7 @@
           <w:p>
             <w:r>
               <w:rPr>
-                <w:rFonts w:ascii="宋体" w:hAnsi="宋体" w:eastAsia="宋体"/>
+                <w:rFonts w:ascii="微软雅黑" w:hAnsi="微软雅黑" w:eastAsia="微软雅黑" w:cs="微软雅黑"/>
                 <w:sz w:val="18"/>
               </w:rPr>
               <w:t>点击复制</w:t>
@@ -1952,7 +1996,7 @@
           <w:p>
             <w:r>
               <w:rPr>
-                <w:rFonts w:ascii="宋体" w:hAnsi="宋体" w:eastAsia="宋体"/>
+                <w:rFonts w:ascii="微软雅黑" w:hAnsi="微软雅黑" w:eastAsia="微软雅黑" w:cs="微软雅黑"/>
                 <w:sz w:val="18"/>
               </w:rPr>
               <w:t>剪贴板内容与展示一致</w:t>
@@ -1973,6 +2017,11 @@
         <w:pStyle w:val="Heading2"/>
       </w:pPr>
       <w:r>
+        <w:rPr>
+          <w:rFonts w:ascii="黑体" w:hAnsi="黑体" w:eastAsia="黑体" w:cs="黑体"/>
+          <w:b/>
+          <w:sz w:val="24"/>
+        </w:rPr>
         <w:t>3.4 海报分享</w:t>
       </w:r>
     </w:p>
@@ -1998,7 +2047,7 @@
           <w:p>
             <w:r>
               <w:rPr>
-                <w:rFonts w:ascii="宋体" w:hAnsi="宋体" w:eastAsia="宋体"/>
+                <w:rFonts w:ascii="微软雅黑" w:hAnsi="微软雅黑" w:eastAsia="微软雅黑" w:cs="微软雅黑"/>
                 <w:sz w:val="20"/>
               </w:rPr>
               <w:t>编号</w:t>
@@ -2012,7 +2061,7 @@
           <w:p>
             <w:r>
               <w:rPr>
-                <w:rFonts w:ascii="宋体" w:hAnsi="宋体" w:eastAsia="宋体"/>
+                <w:rFonts w:ascii="微软雅黑" w:hAnsi="微软雅黑" w:eastAsia="微软雅黑" w:cs="微软雅黑"/>
                 <w:sz w:val="20"/>
               </w:rPr>
               <w:t>用例名称</w:t>
@@ -2026,7 +2075,7 @@
           <w:p>
             <w:r>
               <w:rPr>
-                <w:rFonts w:ascii="宋体" w:hAnsi="宋体" w:eastAsia="宋体"/>
+                <w:rFonts w:ascii="微软雅黑" w:hAnsi="微软雅黑" w:eastAsia="微软雅黑" w:cs="微软雅黑"/>
                 <w:sz w:val="20"/>
               </w:rPr>
               <w:t>前置条件</w:t>
@@ -2040,7 +2089,7 @@
           <w:p>
             <w:r>
               <w:rPr>
-                <w:rFonts w:ascii="宋体" w:hAnsi="宋体" w:eastAsia="宋体"/>
+                <w:rFonts w:ascii="微软雅黑" w:hAnsi="微软雅黑" w:eastAsia="微软雅黑" w:cs="微软雅黑"/>
                 <w:sz w:val="20"/>
               </w:rPr>
               <w:t>操作步骤</w:t>
@@ -2054,7 +2103,7 @@
           <w:p>
             <w:r>
               <w:rPr>
-                <w:rFonts w:ascii="宋体" w:hAnsi="宋体" w:eastAsia="宋体"/>
+                <w:rFonts w:ascii="微软雅黑" w:hAnsi="微软雅黑" w:eastAsia="微软雅黑" w:cs="微软雅黑"/>
                 <w:sz w:val="20"/>
               </w:rPr>
               <w:t>预期结果</w:t>
@@ -2068,7 +2117,7 @@
           <w:p>
             <w:r>
               <w:rPr>
-                <w:rFonts w:ascii="宋体" w:hAnsi="宋体" w:eastAsia="宋体"/>
+                <w:rFonts w:ascii="微软雅黑" w:hAnsi="微软雅黑" w:eastAsia="微软雅黑" w:cs="微软雅黑"/>
                 <w:sz w:val="20"/>
               </w:rPr>
               <w:t>实测结果</w:t>
@@ -2084,7 +2133,7 @@
           <w:p>
             <w:r>
               <w:rPr>
-                <w:rFonts w:ascii="宋体" w:hAnsi="宋体" w:eastAsia="宋体"/>
+                <w:rFonts w:ascii="微软雅黑" w:hAnsi="微软雅黑" w:eastAsia="微软雅黑" w:cs="微软雅黑"/>
                 <w:sz w:val="18"/>
               </w:rPr>
               <w:t>P-01</w:t>
@@ -2098,7 +2147,7 @@
           <w:p>
             <w:r>
               <w:rPr>
-                <w:rFonts w:ascii="宋体" w:hAnsi="宋体" w:eastAsia="宋体"/>
+                <w:rFonts w:ascii="微软雅黑" w:hAnsi="微软雅黑" w:eastAsia="微软雅黑" w:cs="微软雅黑"/>
                 <w:sz w:val="18"/>
               </w:rPr>
               <w:t>生成海报</w:t>
@@ -2112,7 +2161,7 @@
           <w:p>
             <w:r>
               <w:rPr>
-                <w:rFonts w:ascii="宋体" w:hAnsi="宋体" w:eastAsia="宋体"/>
+                <w:rFonts w:ascii="微软雅黑" w:hAnsi="微软雅黑" w:eastAsia="微软雅黑" w:cs="微软雅黑"/>
                 <w:sz w:val="18"/>
               </w:rPr>
               <w:t>任务已完成</w:t>
@@ -2126,7 +2175,7 @@
           <w:p>
             <w:r>
               <w:rPr>
-                <w:rFonts w:ascii="宋体" w:hAnsi="宋体" w:eastAsia="宋体"/>
+                <w:rFonts w:ascii="微软雅黑" w:hAnsi="微软雅黑" w:eastAsia="微软雅黑" w:cs="微软雅黑"/>
                 <w:sz w:val="18"/>
               </w:rPr>
               <w:t>卡片页点击「分享海报」</w:t>
@@ -2140,7 +2189,7 @@
           <w:p>
             <w:r>
               <w:rPr>
-                <w:rFonts w:ascii="宋体" w:hAnsi="宋体" w:eastAsia="宋体"/>
+                <w:rFonts w:ascii="微软雅黑" w:hAnsi="微软雅黑" w:eastAsia="微软雅黑" w:cs="微软雅黑"/>
                 <w:sz w:val="18"/>
               </w:rPr>
               <w:t>请求成功，可下载或预览海报图</w:t>
@@ -2162,7 +2211,7 @@
           <w:p>
             <w:r>
               <w:rPr>
-                <w:rFonts w:ascii="宋体" w:hAnsi="宋体" w:eastAsia="宋体"/>
+                <w:rFonts w:ascii="微软雅黑" w:hAnsi="微软雅黑" w:eastAsia="微软雅黑" w:cs="微软雅黑"/>
                 <w:sz w:val="18"/>
               </w:rPr>
               <w:t>P-02</w:t>
@@ -2176,7 +2225,7 @@
           <w:p>
             <w:r>
               <w:rPr>
-                <w:rFonts w:ascii="宋体" w:hAnsi="宋体" w:eastAsia="宋体"/>
+                <w:rFonts w:ascii="微软雅黑" w:hAnsi="微软雅黑" w:eastAsia="微软雅黑" w:cs="微软雅黑"/>
                 <w:sz w:val="18"/>
               </w:rPr>
               <w:t>海报内容</w:t>
@@ -2190,7 +2239,7 @@
           <w:p>
             <w:r>
               <w:rPr>
-                <w:rFonts w:ascii="宋体" w:hAnsi="宋体" w:eastAsia="宋体"/>
+                <w:rFonts w:ascii="微软雅黑" w:hAnsi="微软雅黑" w:eastAsia="微软雅黑" w:cs="微软雅黑"/>
                 <w:sz w:val="18"/>
               </w:rPr>
               <w:t>同上</w:t>
@@ -2204,7 +2253,7 @@
           <w:p>
             <w:r>
               <w:rPr>
-                <w:rFonts w:ascii="宋体" w:hAnsi="宋体" w:eastAsia="宋体"/>
+                <w:rFonts w:ascii="微软雅黑" w:hAnsi="微软雅黑" w:eastAsia="微软雅黑" w:cs="微软雅黑"/>
                 <w:sz w:val="18"/>
               </w:rPr>
               <w:t>打开生成的图片</w:t>
@@ -2218,7 +2267,7 @@
           <w:p>
             <w:r>
               <w:rPr>
-                <w:rFonts w:ascii="宋体" w:hAnsi="宋体" w:eastAsia="宋体"/>
+                <w:rFonts w:ascii="微软雅黑" w:hAnsi="微软雅黑" w:eastAsia="微软雅黑" w:cs="微软雅黑"/>
                 <w:sz w:val="18"/>
               </w:rPr>
               <w:t>含标题、情绪、治愈文案、品牌水印等设计元素</w:t>
@@ -2239,6 +2288,11 @@
         <w:pStyle w:val="Heading2"/>
       </w:pPr>
       <w:r>
+        <w:rPr>
+          <w:rFonts w:ascii="黑体" w:hAnsi="黑体" w:eastAsia="黑体" w:cs="黑体"/>
+          <w:b/>
+          <w:sz w:val="24"/>
+        </w:rPr>
         <w:t>3.5 每周总结</w:t>
       </w:r>
     </w:p>
@@ -2264,7 +2318,7 @@
           <w:p>
             <w:r>
               <w:rPr>
-                <w:rFonts w:ascii="宋体" w:hAnsi="宋体" w:eastAsia="宋体"/>
+                <w:rFonts w:ascii="微软雅黑" w:hAnsi="微软雅黑" w:eastAsia="微软雅黑" w:cs="微软雅黑"/>
                 <w:sz w:val="20"/>
               </w:rPr>
               <w:t>编号</w:t>
@@ -2278,7 +2332,7 @@
           <w:p>
             <w:r>
               <w:rPr>
-                <w:rFonts w:ascii="宋体" w:hAnsi="宋体" w:eastAsia="宋体"/>
+                <w:rFonts w:ascii="微软雅黑" w:hAnsi="微软雅黑" w:eastAsia="微软雅黑" w:cs="微软雅黑"/>
                 <w:sz w:val="20"/>
               </w:rPr>
               <w:t>用例名称</w:t>
@@ -2292,7 +2346,7 @@
           <w:p>
             <w:r>
               <w:rPr>
-                <w:rFonts w:ascii="宋体" w:hAnsi="宋体" w:eastAsia="宋体"/>
+                <w:rFonts w:ascii="微软雅黑" w:hAnsi="微软雅黑" w:eastAsia="微软雅黑" w:cs="微软雅黑"/>
                 <w:sz w:val="20"/>
               </w:rPr>
               <w:t>前置条件</w:t>
@@ -2306,7 +2360,7 @@
           <w:p>
             <w:r>
               <w:rPr>
-                <w:rFonts w:ascii="宋体" w:hAnsi="宋体" w:eastAsia="宋体"/>
+                <w:rFonts w:ascii="微软雅黑" w:hAnsi="微软雅黑" w:eastAsia="微软雅黑" w:cs="微软雅黑"/>
                 <w:sz w:val="20"/>
               </w:rPr>
               <w:t>操作步骤</w:t>
@@ -2320,7 +2374,7 @@
           <w:p>
             <w:r>
               <w:rPr>
-                <w:rFonts w:ascii="宋体" w:hAnsi="宋体" w:eastAsia="宋体"/>
+                <w:rFonts w:ascii="微软雅黑" w:hAnsi="微软雅黑" w:eastAsia="微软雅黑" w:cs="微软雅黑"/>
                 <w:sz w:val="20"/>
               </w:rPr>
               <w:t>预期结果</w:t>
@@ -2334,7 +2388,7 @@
           <w:p>
             <w:r>
               <w:rPr>
-                <w:rFonts w:ascii="宋体" w:hAnsi="宋体" w:eastAsia="宋体"/>
+                <w:rFonts w:ascii="微软雅黑" w:hAnsi="微软雅黑" w:eastAsia="微软雅黑" w:cs="微软雅黑"/>
                 <w:sz w:val="20"/>
               </w:rPr>
               <w:t>实测结果</w:t>
@@ -2350,7 +2404,7 @@
           <w:p>
             <w:r>
               <w:rPr>
-                <w:rFonts w:ascii="宋体" w:hAnsi="宋体" w:eastAsia="宋体"/>
+                <w:rFonts w:ascii="微软雅黑" w:hAnsi="微软雅黑" w:eastAsia="微软雅黑" w:cs="微软雅黑"/>
                 <w:sz w:val="18"/>
               </w:rPr>
               <w:t>W-01</w:t>
@@ -2364,7 +2418,7 @@
           <w:p>
             <w:r>
               <w:rPr>
-                <w:rFonts w:ascii="宋体" w:hAnsi="宋体" w:eastAsia="宋体"/>
+                <w:rFonts w:ascii="微软雅黑" w:hAnsi="微软雅黑" w:eastAsia="微软雅黑" w:cs="微软雅黑"/>
                 <w:sz w:val="18"/>
               </w:rPr>
               <w:t>生成周报</w:t>
@@ -2378,7 +2432,7 @@
           <w:p>
             <w:r>
               <w:rPr>
-                <w:rFonts w:ascii="宋体" w:hAnsi="宋体" w:eastAsia="宋体"/>
+                <w:rFonts w:ascii="微软雅黑" w:hAnsi="微软雅黑" w:eastAsia="微软雅黑" w:cs="微软雅黑"/>
                 <w:sz w:val="18"/>
               </w:rPr>
               <w:t>当周有足够记录（视业务规则）</w:t>
@@ -2392,7 +2446,7 @@
           <w:p>
             <w:r>
               <w:rPr>
-                <w:rFonts w:ascii="宋体" w:hAnsi="宋体" w:eastAsia="宋体"/>
+                <w:rFonts w:ascii="微软雅黑" w:hAnsi="微软雅黑" w:eastAsia="微软雅黑" w:cs="微软雅黑"/>
                 <w:sz w:val="18"/>
               </w:rPr>
               <w:t>在周报页点击生成</w:t>
@@ -2406,7 +2460,7 @@
           <w:p>
             <w:r>
               <w:rPr>
-                <w:rFonts w:ascii="宋体" w:hAnsi="宋体" w:eastAsia="宋体"/>
+                <w:rFonts w:ascii="微软雅黑" w:hAnsi="微软雅黑" w:eastAsia="微软雅黑" w:cs="微软雅黑"/>
                 <w:sz w:val="18"/>
               </w:rPr>
               <w:t>返回成功，列表出现新摘要</w:t>
@@ -2428,7 +2482,7 @@
           <w:p>
             <w:r>
               <w:rPr>
-                <w:rFonts w:ascii="宋体" w:hAnsi="宋体" w:eastAsia="宋体"/>
+                <w:rFonts w:ascii="微软雅黑" w:hAnsi="微软雅黑" w:eastAsia="微软雅黑" w:cs="微软雅黑"/>
                 <w:sz w:val="18"/>
               </w:rPr>
               <w:t>W-02</w:t>
@@ -2442,7 +2496,7 @@
           <w:p>
             <w:r>
               <w:rPr>
-                <w:rFonts w:ascii="宋体" w:hAnsi="宋体" w:eastAsia="宋体"/>
+                <w:rFonts w:ascii="微软雅黑" w:hAnsi="微软雅黑" w:eastAsia="微软雅黑" w:cs="微软雅黑"/>
                 <w:sz w:val="18"/>
               </w:rPr>
               <w:t>查看历史周报</w:t>
@@ -2456,7 +2510,7 @@
           <w:p>
             <w:r>
               <w:rPr>
-                <w:rFonts w:ascii="宋体" w:hAnsi="宋体" w:eastAsia="宋体"/>
+                <w:rFonts w:ascii="微软雅黑" w:hAnsi="微软雅黑" w:eastAsia="微软雅黑" w:cs="微软雅黑"/>
                 <w:sz w:val="18"/>
               </w:rPr>
               <w:t>已有周报</w:t>
@@ -2470,7 +2524,7 @@
           <w:p>
             <w:r>
               <w:rPr>
-                <w:rFonts w:ascii="宋体" w:hAnsi="宋体" w:eastAsia="宋体"/>
+                <w:rFonts w:ascii="微软雅黑" w:hAnsi="微软雅黑" w:eastAsia="微软雅黑" w:cs="微软雅黑"/>
                 <w:sz w:val="18"/>
               </w:rPr>
               <w:t>打开列表</w:t>
@@ -2484,7 +2538,7 @@
           <w:p>
             <w:r>
               <w:rPr>
-                <w:rFonts w:ascii="宋体" w:hAnsi="宋体" w:eastAsia="宋体"/>
+                <w:rFonts w:ascii="微软雅黑" w:hAnsi="微软雅黑" w:eastAsia="微软雅黑" w:cs="微软雅黑"/>
                 <w:sz w:val="18"/>
               </w:rPr>
               <w:t>展示周区间、摘要、趋势等字段</w:t>
@@ -2505,6 +2559,11 @@
         <w:pStyle w:val="Heading2"/>
       </w:pPr>
       <w:r>
+        <w:rPr>
+          <w:rFonts w:ascii="黑体" w:hAnsi="黑体" w:eastAsia="黑体" w:cs="黑体"/>
+          <w:b/>
+          <w:sz w:val="24"/>
+        </w:rPr>
         <w:t>3.6 AI 对话陪伴</w:t>
       </w:r>
     </w:p>
@@ -2530,7 +2589,7 @@
           <w:p>
             <w:r>
               <w:rPr>
-                <w:rFonts w:ascii="宋体" w:hAnsi="宋体" w:eastAsia="宋体"/>
+                <w:rFonts w:ascii="微软雅黑" w:hAnsi="微软雅黑" w:eastAsia="微软雅黑" w:cs="微软雅黑"/>
                 <w:sz w:val="20"/>
               </w:rPr>
               <w:t>编号</w:t>
@@ -2544,7 +2603,7 @@
           <w:p>
             <w:r>
               <w:rPr>
-                <w:rFonts w:ascii="宋体" w:hAnsi="宋体" w:eastAsia="宋体"/>
+                <w:rFonts w:ascii="微软雅黑" w:hAnsi="微软雅黑" w:eastAsia="微软雅黑" w:cs="微软雅黑"/>
                 <w:sz w:val="20"/>
               </w:rPr>
               <w:t>用例名称</w:t>
@@ -2558,7 +2617,7 @@
           <w:p>
             <w:r>
               <w:rPr>
-                <w:rFonts w:ascii="宋体" w:hAnsi="宋体" w:eastAsia="宋体"/>
+                <w:rFonts w:ascii="微软雅黑" w:hAnsi="微软雅黑" w:eastAsia="微软雅黑" w:cs="微软雅黑"/>
                 <w:sz w:val="20"/>
               </w:rPr>
               <w:t>前置条件</w:t>
@@ -2572,7 +2631,7 @@
           <w:p>
             <w:r>
               <w:rPr>
-                <w:rFonts w:ascii="宋体" w:hAnsi="宋体" w:eastAsia="宋体"/>
+                <w:rFonts w:ascii="微软雅黑" w:hAnsi="微软雅黑" w:eastAsia="微软雅黑" w:cs="微软雅黑"/>
                 <w:sz w:val="20"/>
               </w:rPr>
               <w:t>操作步骤</w:t>
@@ -2586,7 +2645,7 @@
           <w:p>
             <w:r>
               <w:rPr>
-                <w:rFonts w:ascii="宋体" w:hAnsi="宋体" w:eastAsia="宋体"/>
+                <w:rFonts w:ascii="微软雅黑" w:hAnsi="微软雅黑" w:eastAsia="微软雅黑" w:cs="微软雅黑"/>
                 <w:sz w:val="20"/>
               </w:rPr>
               <w:t>预期结果</w:t>
@@ -2600,7 +2659,7 @@
           <w:p>
             <w:r>
               <w:rPr>
-                <w:rFonts w:ascii="宋体" w:hAnsi="宋体" w:eastAsia="宋体"/>
+                <w:rFonts w:ascii="微软雅黑" w:hAnsi="微软雅黑" w:eastAsia="微软雅黑" w:cs="微软雅黑"/>
                 <w:sz w:val="20"/>
               </w:rPr>
               <w:t>实测结果</w:t>
@@ -2616,7 +2675,7 @@
           <w:p>
             <w:r>
               <w:rPr>
-                <w:rFonts w:ascii="宋体" w:hAnsi="宋体" w:eastAsia="宋体"/>
+                <w:rFonts w:ascii="微软雅黑" w:hAnsi="微软雅黑" w:eastAsia="微软雅黑" w:cs="微软雅黑"/>
                 <w:sz w:val="18"/>
               </w:rPr>
               <w:t>C-01</w:t>
@@ -2630,7 +2689,7 @@
           <w:p>
             <w:r>
               <w:rPr>
-                <w:rFonts w:ascii="宋体" w:hAnsi="宋体" w:eastAsia="宋体"/>
+                <w:rFonts w:ascii="微软雅黑" w:hAnsi="微软雅黑" w:eastAsia="微软雅黑" w:cs="微软雅黑"/>
                 <w:sz w:val="18"/>
               </w:rPr>
               <w:t>发送消息</w:t>
@@ -2644,7 +2703,7 @@
           <w:p>
             <w:r>
               <w:rPr>
-                <w:rFonts w:ascii="宋体" w:hAnsi="宋体" w:eastAsia="宋体"/>
+                <w:rFonts w:ascii="微软雅黑" w:hAnsi="微软雅黑" w:eastAsia="微软雅黑" w:cs="微软雅黑"/>
                 <w:sz w:val="18"/>
               </w:rPr>
               <w:t>已登录，`DASHSCOPE_API_KEY` 有效</w:t>
@@ -2658,7 +2717,7 @@
           <w:p>
             <w:r>
               <w:rPr>
-                <w:rFonts w:ascii="宋体" w:hAnsi="宋体" w:eastAsia="宋体"/>
+                <w:rFonts w:ascii="微软雅黑" w:hAnsi="微软雅黑" w:eastAsia="微软雅黑" w:cs="微软雅黑"/>
                 <w:sz w:val="18"/>
               </w:rPr>
               <w:t>输入短句并发送</w:t>
@@ -2672,7 +2731,7 @@
           <w:p>
             <w:r>
               <w:rPr>
-                <w:rFonts w:ascii="宋体" w:hAnsi="宋体" w:eastAsia="宋体"/>
+                <w:rFonts w:ascii="微软雅黑" w:hAnsi="微软雅黑" w:eastAsia="微软雅黑" w:cs="微软雅黑"/>
                 <w:sz w:val="18"/>
               </w:rPr>
               <w:t>收到助手回复，无 500 错误</w:t>
@@ -2694,7 +2753,7 @@
           <w:p>
             <w:r>
               <w:rPr>
-                <w:rFonts w:ascii="宋体" w:hAnsi="宋体" w:eastAsia="宋体"/>
+                <w:rFonts w:ascii="微软雅黑" w:hAnsi="微软雅黑" w:eastAsia="微软雅黑" w:cs="微软雅黑"/>
                 <w:sz w:val="18"/>
               </w:rPr>
               <w:t>C-02</w:t>
@@ -2708,7 +2767,7 @@
           <w:p>
             <w:r>
               <w:rPr>
-                <w:rFonts w:ascii="宋体" w:hAnsi="宋体" w:eastAsia="宋体"/>
+                <w:rFonts w:ascii="微软雅黑" w:hAnsi="微软雅黑" w:eastAsia="微软雅黑" w:cs="微软雅黑"/>
                 <w:sz w:val="18"/>
               </w:rPr>
               <w:t>多轮对话</w:t>
@@ -2722,7 +2781,7 @@
           <w:p>
             <w:r>
               <w:rPr>
-                <w:rFonts w:ascii="宋体" w:hAnsi="宋体" w:eastAsia="宋体"/>
+                <w:rFonts w:ascii="微软雅黑" w:hAnsi="微软雅黑" w:eastAsia="微软雅黑" w:cs="微软雅黑"/>
                 <w:sz w:val="18"/>
               </w:rPr>
               <w:t>同上</w:t>
@@ -2736,7 +2795,7 @@
           <w:p>
             <w:r>
               <w:rPr>
-                <w:rFonts w:ascii="宋体" w:hAnsi="宋体" w:eastAsia="宋体"/>
+                <w:rFonts w:ascii="微软雅黑" w:hAnsi="微软雅黑" w:eastAsia="微软雅黑" w:cs="微软雅黑"/>
                 <w:sz w:val="18"/>
               </w:rPr>
               <w:t>连续发送多条</w:t>
@@ -2750,7 +2809,7 @@
           <w:p>
             <w:r>
               <w:rPr>
-                <w:rFonts w:ascii="宋体" w:hAnsi="宋体" w:eastAsia="宋体"/>
+                <w:rFonts w:ascii="微软雅黑" w:hAnsi="微软雅黑" w:eastAsia="微软雅黑" w:cs="微软雅黑"/>
                 <w:sz w:val="18"/>
               </w:rPr>
               <w:t>上下文连贯（后端基于近期历史）</w:t>
@@ -2772,7 +2831,7 @@
           <w:p>
             <w:r>
               <w:rPr>
-                <w:rFonts w:ascii="宋体" w:hAnsi="宋体" w:eastAsia="宋体"/>
+                <w:rFonts w:ascii="微软雅黑" w:hAnsi="微软雅黑" w:eastAsia="微软雅黑" w:cs="微软雅黑"/>
                 <w:sz w:val="18"/>
               </w:rPr>
               <w:t>C-03</w:t>
@@ -2786,7 +2845,7 @@
           <w:p>
             <w:r>
               <w:rPr>
-                <w:rFonts w:ascii="宋体" w:hAnsi="宋体" w:eastAsia="宋体"/>
+                <w:rFonts w:ascii="微软雅黑" w:hAnsi="微软雅黑" w:eastAsia="微软雅黑" w:cs="微软雅黑"/>
                 <w:sz w:val="18"/>
               </w:rPr>
               <w:t>历史持久化</w:t>
@@ -2800,7 +2859,7 @@
           <w:p>
             <w:r>
               <w:rPr>
-                <w:rFonts w:ascii="宋体" w:hAnsi="宋体" w:eastAsia="宋体"/>
+                <w:rFonts w:ascii="微软雅黑" w:hAnsi="微软雅黑" w:eastAsia="微软雅黑" w:cs="微软雅黑"/>
                 <w:sz w:val="18"/>
               </w:rPr>
               <w:t>同上</w:t>
@@ -2814,7 +2873,7 @@
           <w:p>
             <w:r>
               <w:rPr>
-                <w:rFonts w:ascii="宋体" w:hAnsi="宋体" w:eastAsia="宋体"/>
+                <w:rFonts w:ascii="微软雅黑" w:hAnsi="微软雅黑" w:eastAsia="微软雅黑" w:cs="微软雅黑"/>
                 <w:sz w:val="18"/>
               </w:rPr>
               <w:t>刷新页面或重新进入对话页</w:t>
@@ -2828,7 +2887,7 @@
           <w:p>
             <w:r>
               <w:rPr>
-                <w:rFonts w:ascii="宋体" w:hAnsi="宋体" w:eastAsia="宋体"/>
+                <w:rFonts w:ascii="微软雅黑" w:hAnsi="微软雅黑" w:eastAsia="微软雅黑" w:cs="微软雅黑"/>
                 <w:sz w:val="18"/>
               </w:rPr>
               <w:t>历史记录从服务端加载（若已部署含 DB 表版本）</w:t>
@@ -2850,7 +2909,7 @@
           <w:p>
             <w:r>
               <w:rPr>
-                <w:rFonts w:ascii="宋体" w:hAnsi="宋体" w:eastAsia="宋体"/>
+                <w:rFonts w:ascii="微软雅黑" w:hAnsi="微软雅黑" w:eastAsia="微软雅黑" w:cs="微软雅黑"/>
                 <w:sz w:val="18"/>
               </w:rPr>
               <w:t>C-04</w:t>
@@ -2864,7 +2923,7 @@
           <w:p>
             <w:r>
               <w:rPr>
-                <w:rFonts w:ascii="宋体" w:hAnsi="宋体" w:eastAsia="宋体"/>
+                <w:rFonts w:ascii="微软雅黑" w:hAnsi="微软雅黑" w:eastAsia="微软雅黑" w:cs="微软雅黑"/>
                 <w:sz w:val="18"/>
               </w:rPr>
               <w:t>清空记录</w:t>
@@ -2878,7 +2937,7 @@
           <w:p>
             <w:r>
               <w:rPr>
-                <w:rFonts w:ascii="宋体" w:hAnsi="宋体" w:eastAsia="宋体"/>
+                <w:rFonts w:ascii="微软雅黑" w:hAnsi="微软雅黑" w:eastAsia="微软雅黑" w:cs="微软雅黑"/>
                 <w:sz w:val="18"/>
               </w:rPr>
               <w:t>有历史</w:t>
@@ -2892,7 +2951,7 @@
           <w:p>
             <w:r>
               <w:rPr>
-                <w:rFonts w:ascii="宋体" w:hAnsi="宋体" w:eastAsia="宋体"/>
+                <w:rFonts w:ascii="微软雅黑" w:hAnsi="微软雅黑" w:eastAsia="微软雅黑" w:cs="微软雅黑"/>
                 <w:sz w:val="18"/>
               </w:rPr>
               <w:t>点击清空并确认</w:t>
@@ -2906,7 +2965,7 @@
           <w:p>
             <w:r>
               <w:rPr>
-                <w:rFonts w:ascii="宋体" w:hAnsi="宋体" w:eastAsia="宋体"/>
+                <w:rFonts w:ascii="微软雅黑" w:hAnsi="微软雅黑" w:eastAsia="微软雅黑" w:cs="微软雅黑"/>
                 <w:sz w:val="18"/>
               </w:rPr>
               <w:t>对话列表重置为欢迎语</w:t>
@@ -2927,6 +2986,11 @@
         <w:pStyle w:val="Heading2"/>
       </w:pPr>
       <w:r>
+        <w:rPr>
+          <w:rFonts w:ascii="黑体" w:hAnsi="黑体" w:eastAsia="黑体" w:cs="黑体"/>
+          <w:b/>
+          <w:sz w:val="24"/>
+        </w:rPr>
         <w:t>3.7 音乐治愈</w:t>
       </w:r>
     </w:p>
@@ -2952,7 +3016,7 @@
           <w:p>
             <w:r>
               <w:rPr>
-                <w:rFonts w:ascii="宋体" w:hAnsi="宋体" w:eastAsia="宋体"/>
+                <w:rFonts w:ascii="微软雅黑" w:hAnsi="微软雅黑" w:eastAsia="微软雅黑" w:cs="微软雅黑"/>
                 <w:sz w:val="20"/>
               </w:rPr>
               <w:t>编号</w:t>
@@ -2966,7 +3030,7 @@
           <w:p>
             <w:r>
               <w:rPr>
-                <w:rFonts w:ascii="宋体" w:hAnsi="宋体" w:eastAsia="宋体"/>
+                <w:rFonts w:ascii="微软雅黑" w:hAnsi="微软雅黑" w:eastAsia="微软雅黑" w:cs="微软雅黑"/>
                 <w:sz w:val="20"/>
               </w:rPr>
               <w:t>用例名称</w:t>
@@ -2980,7 +3044,7 @@
           <w:p>
             <w:r>
               <w:rPr>
-                <w:rFonts w:ascii="宋体" w:hAnsi="宋体" w:eastAsia="宋体"/>
+                <w:rFonts w:ascii="微软雅黑" w:hAnsi="微软雅黑" w:eastAsia="微软雅黑" w:cs="微软雅黑"/>
                 <w:sz w:val="20"/>
               </w:rPr>
               <w:t>前置条件</w:t>
@@ -2994,7 +3058,7 @@
           <w:p>
             <w:r>
               <w:rPr>
-                <w:rFonts w:ascii="宋体" w:hAnsi="宋体" w:eastAsia="宋体"/>
+                <w:rFonts w:ascii="微软雅黑" w:hAnsi="微软雅黑" w:eastAsia="微软雅黑" w:cs="微软雅黑"/>
                 <w:sz w:val="20"/>
               </w:rPr>
               <w:t>操作步骤</w:t>
@@ -3008,7 +3072,7 @@
           <w:p>
             <w:r>
               <w:rPr>
-                <w:rFonts w:ascii="宋体" w:hAnsi="宋体" w:eastAsia="宋体"/>
+                <w:rFonts w:ascii="微软雅黑" w:hAnsi="微软雅黑" w:eastAsia="微软雅黑" w:cs="微软雅黑"/>
                 <w:sz w:val="20"/>
               </w:rPr>
               <w:t>预期结果</w:t>
@@ -3022,7 +3086,7 @@
           <w:p>
             <w:r>
               <w:rPr>
-                <w:rFonts w:ascii="宋体" w:hAnsi="宋体" w:eastAsia="宋体"/>
+                <w:rFonts w:ascii="微软雅黑" w:hAnsi="微软雅黑" w:eastAsia="微软雅黑" w:cs="微软雅黑"/>
                 <w:sz w:val="20"/>
               </w:rPr>
               <w:t>实测结果</w:t>
@@ -3038,7 +3102,7 @@
           <w:p>
             <w:r>
               <w:rPr>
-                <w:rFonts w:ascii="宋体" w:hAnsi="宋体" w:eastAsia="宋体"/>
+                <w:rFonts w:ascii="微软雅黑" w:hAnsi="微软雅黑" w:eastAsia="微软雅黑" w:cs="微软雅黑"/>
                 <w:sz w:val="18"/>
               </w:rPr>
               <w:t>M-01</w:t>
@@ -3052,7 +3116,7 @@
           <w:p>
             <w:r>
               <w:rPr>
-                <w:rFonts w:ascii="宋体" w:hAnsi="宋体" w:eastAsia="宋体"/>
+                <w:rFonts w:ascii="微软雅黑" w:hAnsi="微软雅黑" w:eastAsia="微软雅黑" w:cs="微软雅黑"/>
                 <w:sz w:val="18"/>
               </w:rPr>
               <w:t>列表加载</w:t>
@@ -3066,7 +3130,7 @@
           <w:p>
             <w:r>
               <w:rPr>
-                <w:rFonts w:ascii="宋体" w:hAnsi="宋体" w:eastAsia="宋体"/>
+                <w:rFonts w:ascii="微软雅黑" w:hAnsi="微软雅黑" w:eastAsia="微软雅黑" w:cs="微软雅黑"/>
                 <w:sz w:val="18"/>
               </w:rPr>
               <w:t>已登录</w:t>
@@ -3080,7 +3144,7 @@
           <w:p>
             <w:r>
               <w:rPr>
-                <w:rFonts w:ascii="宋体" w:hAnsi="宋体" w:eastAsia="宋体"/>
+                <w:rFonts w:ascii="微软雅黑" w:hAnsi="微软雅黑" w:eastAsia="微软雅黑" w:cs="微软雅黑"/>
                 <w:sz w:val="18"/>
               </w:rPr>
               <w:t>打开音乐页</w:t>
@@ -3094,7 +3158,7 @@
           <w:p>
             <w:r>
               <w:rPr>
-                <w:rFonts w:ascii="宋体" w:hAnsi="宋体" w:eastAsia="宋体"/>
+                <w:rFonts w:ascii="微软雅黑" w:hAnsi="微软雅黑" w:eastAsia="微软雅黑" w:cs="微软雅黑"/>
                 <w:sz w:val="18"/>
               </w:rPr>
               <w:t>展示曲目列表，URL 为可访问地址</w:t>
@@ -3116,7 +3180,7 @@
           <w:p>
             <w:r>
               <w:rPr>
-                <w:rFonts w:ascii="宋体" w:hAnsi="宋体" w:eastAsia="宋体"/>
+                <w:rFonts w:ascii="微软雅黑" w:hAnsi="微软雅黑" w:eastAsia="微软雅黑" w:cs="微软雅黑"/>
                 <w:sz w:val="18"/>
               </w:rPr>
               <w:t>M-02</w:t>
@@ -3130,7 +3194,7 @@
           <w:p>
             <w:r>
               <w:rPr>
-                <w:rFonts w:ascii="宋体" w:hAnsi="宋体" w:eastAsia="宋体"/>
+                <w:rFonts w:ascii="微软雅黑" w:hAnsi="微软雅黑" w:eastAsia="微软雅黑" w:cs="微软雅黑"/>
                 <w:sz w:val="18"/>
               </w:rPr>
               <w:t>情绪筛选</w:t>
@@ -3144,7 +3208,7 @@
           <w:p>
             <w:r>
               <w:rPr>
-                <w:rFonts w:ascii="宋体" w:hAnsi="宋体" w:eastAsia="宋体"/>
+                <w:rFonts w:ascii="微软雅黑" w:hAnsi="微软雅黑" w:eastAsia="微软雅黑" w:cs="微软雅黑"/>
                 <w:sz w:val="18"/>
               </w:rPr>
               <w:t>同上</w:t>
@@ -3158,7 +3222,7 @@
           <w:p>
             <w:r>
               <w:rPr>
-                <w:rFonts w:ascii="宋体" w:hAnsi="宋体" w:eastAsia="宋体"/>
+                <w:rFonts w:ascii="微软雅黑" w:hAnsi="微软雅黑" w:eastAsia="微软雅黑" w:cs="微软雅黑"/>
                 <w:sz w:val="18"/>
               </w:rPr>
               <w:t>切换情绪标签</w:t>
@@ -3172,7 +3236,7 @@
           <w:p>
             <w:r>
               <w:rPr>
-                <w:rFonts w:ascii="宋体" w:hAnsi="宋体" w:eastAsia="宋体"/>
+                <w:rFonts w:ascii="微软雅黑" w:hAnsi="微软雅黑" w:eastAsia="微软雅黑" w:cs="微软雅黑"/>
                 <w:sz w:val="18"/>
               </w:rPr>
               <w:t>列表顺序或内容随情绪推荐变化</w:t>
@@ -3194,7 +3258,7 @@
           <w:p>
             <w:r>
               <w:rPr>
-                <w:rFonts w:ascii="宋体" w:hAnsi="宋体" w:eastAsia="宋体"/>
+                <w:rFonts w:ascii="微软雅黑" w:hAnsi="微软雅黑" w:eastAsia="微软雅黑" w:cs="微软雅黑"/>
                 <w:sz w:val="18"/>
               </w:rPr>
               <w:t>M-03</w:t>
@@ -3208,7 +3272,7 @@
           <w:p>
             <w:r>
               <w:rPr>
-                <w:rFonts w:ascii="宋体" w:hAnsi="宋体" w:eastAsia="宋体"/>
+                <w:rFonts w:ascii="微软雅黑" w:hAnsi="微软雅黑" w:eastAsia="微软雅黑" w:cs="微软雅黑"/>
                 <w:sz w:val="18"/>
               </w:rPr>
               <w:t>播放控制</w:t>
@@ -3222,7 +3286,7 @@
           <w:p>
             <w:r>
               <w:rPr>
-                <w:rFonts w:ascii="宋体" w:hAnsi="宋体" w:eastAsia="宋体"/>
+                <w:rFonts w:ascii="微软雅黑" w:hAnsi="微软雅黑" w:eastAsia="微软雅黑" w:cs="微软雅黑"/>
                 <w:sz w:val="18"/>
               </w:rPr>
               <w:t>同上</w:t>
@@ -3236,7 +3300,7 @@
           <w:p>
             <w:r>
               <w:rPr>
-                <w:rFonts w:ascii="宋体" w:hAnsi="宋体" w:eastAsia="宋体"/>
+                <w:rFonts w:ascii="微软雅黑" w:hAnsi="微软雅黑" w:eastAsia="微软雅黑" w:cs="微软雅黑"/>
                 <w:sz w:val="18"/>
               </w:rPr>
               <w:t>点击播放、暂停、拖动进度</w:t>
@@ -3250,7 +3314,7 @@
           <w:p>
             <w:r>
               <w:rPr>
-                <w:rFonts w:ascii="宋体" w:hAnsi="宋体" w:eastAsia="宋体"/>
+                <w:rFonts w:ascii="微软雅黑" w:hAnsi="微软雅黑" w:eastAsia="微软雅黑" w:cs="微软雅黑"/>
                 <w:sz w:val="18"/>
               </w:rPr>
               <w:t>音频行为正常（浏览器策略允许自动播放时）</w:t>
@@ -3271,6 +3335,11 @@
         <w:pStyle w:val="Heading2"/>
       </w:pPr>
       <w:r>
+        <w:rPr>
+          <w:rFonts w:ascii="黑体" w:hAnsi="黑体" w:eastAsia="黑体" w:cs="黑体"/>
+          <w:b/>
+          <w:sz w:val="24"/>
+        </w:rPr>
         <w:t>3.8 心情打卡与首页</w:t>
       </w:r>
     </w:p>
@@ -3296,7 +3365,7 @@
           <w:p>
             <w:r>
               <w:rPr>
-                <w:rFonts w:ascii="宋体" w:hAnsi="宋体" w:eastAsia="宋体"/>
+                <w:rFonts w:ascii="微软雅黑" w:hAnsi="微软雅黑" w:eastAsia="微软雅黑" w:cs="微软雅黑"/>
                 <w:sz w:val="20"/>
               </w:rPr>
               <w:t>编号</w:t>
@@ -3310,7 +3379,7 @@
           <w:p>
             <w:r>
               <w:rPr>
-                <w:rFonts w:ascii="宋体" w:hAnsi="宋体" w:eastAsia="宋体"/>
+                <w:rFonts w:ascii="微软雅黑" w:hAnsi="微软雅黑" w:eastAsia="微软雅黑" w:cs="微软雅黑"/>
                 <w:sz w:val="20"/>
               </w:rPr>
               <w:t>用例名称</w:t>
@@ -3324,7 +3393,7 @@
           <w:p>
             <w:r>
               <w:rPr>
-                <w:rFonts w:ascii="宋体" w:hAnsi="宋体" w:eastAsia="宋体"/>
+                <w:rFonts w:ascii="微软雅黑" w:hAnsi="微软雅黑" w:eastAsia="微软雅黑" w:cs="微软雅黑"/>
                 <w:sz w:val="20"/>
               </w:rPr>
               <w:t>前置条件</w:t>
@@ -3338,7 +3407,7 @@
           <w:p>
             <w:r>
               <w:rPr>
-                <w:rFonts w:ascii="宋体" w:hAnsi="宋体" w:eastAsia="宋体"/>
+                <w:rFonts w:ascii="微软雅黑" w:hAnsi="微软雅黑" w:eastAsia="微软雅黑" w:cs="微软雅黑"/>
                 <w:sz w:val="20"/>
               </w:rPr>
               <w:t>操作步骤</w:t>
@@ -3352,7 +3421,7 @@
           <w:p>
             <w:r>
               <w:rPr>
-                <w:rFonts w:ascii="宋体" w:hAnsi="宋体" w:eastAsia="宋体"/>
+                <w:rFonts w:ascii="微软雅黑" w:hAnsi="微软雅黑" w:eastAsia="微软雅黑" w:cs="微软雅黑"/>
                 <w:sz w:val="20"/>
               </w:rPr>
               <w:t>预期结果</w:t>
@@ -3366,7 +3435,7 @@
           <w:p>
             <w:r>
               <w:rPr>
-                <w:rFonts w:ascii="宋体" w:hAnsi="宋体" w:eastAsia="宋体"/>
+                <w:rFonts w:ascii="微软雅黑" w:hAnsi="微软雅黑" w:eastAsia="微软雅黑" w:cs="微软雅黑"/>
                 <w:sz w:val="20"/>
               </w:rPr>
               <w:t>实测结果</w:t>
@@ -3382,7 +3451,7 @@
           <w:p>
             <w:r>
               <w:rPr>
-                <w:rFonts w:ascii="宋体" w:hAnsi="宋体" w:eastAsia="宋体"/>
+                <w:rFonts w:ascii="微软雅黑" w:hAnsi="微软雅黑" w:eastAsia="微软雅黑" w:cs="微软雅黑"/>
                 <w:sz w:val="18"/>
               </w:rPr>
               <w:t>H-01</w:t>
@@ -3396,7 +3465,7 @@
           <w:p>
             <w:r>
               <w:rPr>
-                <w:rFonts w:ascii="宋体" w:hAnsi="宋体" w:eastAsia="宋体"/>
+                <w:rFonts w:ascii="微软雅黑" w:hAnsi="微软雅黑" w:eastAsia="微软雅黑" w:cs="微软雅黑"/>
                 <w:sz w:val="18"/>
               </w:rPr>
               <w:t>今日心情</w:t>
@@ -3410,7 +3479,7 @@
           <w:p>
             <w:r>
               <w:rPr>
-                <w:rFonts w:ascii="宋体" w:hAnsi="宋体" w:eastAsia="宋体"/>
+                <w:rFonts w:ascii="微软雅黑" w:hAnsi="微软雅黑" w:eastAsia="微软雅黑" w:cs="微软雅黑"/>
                 <w:sz w:val="18"/>
               </w:rPr>
               <w:t>已登录</w:t>
@@ -3424,7 +3493,7 @@
           <w:p>
             <w:r>
               <w:rPr>
-                <w:rFonts w:ascii="宋体" w:hAnsi="宋体" w:eastAsia="宋体"/>
+                <w:rFonts w:ascii="微软雅黑" w:hAnsi="微软雅黑" w:eastAsia="微软雅黑" w:cs="微软雅黑"/>
                 <w:sz w:val="18"/>
               </w:rPr>
               <w:t>选择心情按钮</w:t>
@@ -3438,7 +3507,7 @@
           <w:p>
             <w:r>
               <w:rPr>
-                <w:rFonts w:ascii="宋体" w:hAnsi="宋体" w:eastAsia="宋体"/>
+                <w:rFonts w:ascii="微软雅黑" w:hAnsi="微软雅黑" w:eastAsia="微软雅黑" w:cs="微软雅黑"/>
                 <w:sz w:val="18"/>
               </w:rPr>
               <w:t>接口成功，肯定语更新（若有）</w:t>
@@ -3460,7 +3529,7 @@
           <w:p>
             <w:r>
               <w:rPr>
-                <w:rFonts w:ascii="宋体" w:hAnsi="宋体" w:eastAsia="宋体"/>
+                <w:rFonts w:ascii="微软雅黑" w:hAnsi="微软雅黑" w:eastAsia="微软雅黑" w:cs="微软雅黑"/>
                 <w:sz w:val="18"/>
               </w:rPr>
               <w:t>H-02</w:t>
@@ -3474,7 +3543,7 @@
           <w:p>
             <w:r>
               <w:rPr>
-                <w:rFonts w:ascii="宋体" w:hAnsi="宋体" w:eastAsia="宋体"/>
+                <w:rFonts w:ascii="微软雅黑" w:hAnsi="微软雅黑" w:eastAsia="微软雅黑" w:cs="微软雅黑"/>
                 <w:sz w:val="18"/>
               </w:rPr>
               <w:t>首页快捷入口</w:t>
@@ -3488,7 +3557,7 @@
           <w:p>
             <w:r>
               <w:rPr>
-                <w:rFonts w:ascii="宋体" w:hAnsi="宋体" w:eastAsia="宋体"/>
+                <w:rFonts w:ascii="微软雅黑" w:hAnsi="微软雅黑" w:eastAsia="微软雅黑" w:cs="微软雅黑"/>
                 <w:sz w:val="18"/>
               </w:rPr>
               <w:t>已部署新版前端</w:t>
@@ -3502,7 +3571,7 @@
           <w:p>
             <w:r>
               <w:rPr>
-                <w:rFonts w:ascii="宋体" w:hAnsi="宋体" w:eastAsia="宋体"/>
+                <w:rFonts w:ascii="微软雅黑" w:hAnsi="微软雅黑" w:eastAsia="微软雅黑" w:cs="微软雅黑"/>
                 <w:sz w:val="18"/>
               </w:rPr>
               <w:t>点击 AI 陪伴、音乐治愈</w:t>
@@ -3516,7 +3585,7 @@
           <w:p>
             <w:r>
               <w:rPr>
-                <w:rFonts w:ascii="宋体" w:hAnsi="宋体" w:eastAsia="宋体"/>
+                <w:rFonts w:ascii="微软雅黑" w:hAnsi="微软雅黑" w:eastAsia="微软雅黑" w:cs="微软雅黑"/>
                 <w:sz w:val="18"/>
               </w:rPr>
               <w:t>跳转对应路由页面</w:t>
@@ -3537,6 +3606,11 @@
         <w:pStyle w:val="Heading2"/>
       </w:pPr>
       <w:r>
+        <w:rPr>
+          <w:rFonts w:ascii="黑体" w:hAnsi="黑体" w:eastAsia="黑体" w:cs="黑体"/>
+          <w:b/>
+          <w:sz w:val="24"/>
+        </w:rPr>
         <w:t>3.9 接口与健康（可选由测试人员用浏览器或 Postman 执行）</w:t>
       </w:r>
     </w:p>
@@ -3562,7 +3636,7 @@
           <w:p>
             <w:r>
               <w:rPr>
-                <w:rFonts w:ascii="宋体" w:hAnsi="宋体" w:eastAsia="宋体"/>
+                <w:rFonts w:ascii="微软雅黑" w:hAnsi="微软雅黑" w:eastAsia="微软雅黑" w:cs="微软雅黑"/>
                 <w:sz w:val="20"/>
               </w:rPr>
               <w:t>编号</w:t>
@@ -3576,7 +3650,7 @@
           <w:p>
             <w:r>
               <w:rPr>
-                <w:rFonts w:ascii="宋体" w:hAnsi="宋体" w:eastAsia="宋体"/>
+                <w:rFonts w:ascii="微软雅黑" w:hAnsi="微软雅黑" w:eastAsia="微软雅黑" w:cs="微软雅黑"/>
                 <w:sz w:val="20"/>
               </w:rPr>
               <w:t>接口</w:t>
@@ -3590,7 +3664,7 @@
           <w:p>
             <w:r>
               <w:rPr>
-                <w:rFonts w:ascii="宋体" w:hAnsi="宋体" w:eastAsia="宋体"/>
+                <w:rFonts w:ascii="微软雅黑" w:hAnsi="微软雅黑" w:eastAsia="微软雅黑" w:cs="微软雅黑"/>
                 <w:sz w:val="20"/>
               </w:rPr>
               <w:t>方法</w:t>
@@ -3604,7 +3678,7 @@
           <w:p>
             <w:r>
               <w:rPr>
-                <w:rFonts w:ascii="宋体" w:hAnsi="宋体" w:eastAsia="宋体"/>
+                <w:rFonts w:ascii="微软雅黑" w:hAnsi="微软雅黑" w:eastAsia="微软雅黑" w:cs="微软雅黑"/>
                 <w:sz w:val="20"/>
               </w:rPr>
               <w:t>说明</w:t>
@@ -3618,7 +3692,7 @@
           <w:p>
             <w:r>
               <w:rPr>
-                <w:rFonts w:ascii="宋体" w:hAnsi="宋体" w:eastAsia="宋体"/>
+                <w:rFonts w:ascii="微软雅黑" w:hAnsi="微软雅黑" w:eastAsia="微软雅黑" w:cs="微软雅黑"/>
                 <w:sz w:val="20"/>
               </w:rPr>
               <w:t>预期</w:t>
@@ -3632,7 +3706,7 @@
           <w:p>
             <w:r>
               <w:rPr>
-                <w:rFonts w:ascii="宋体" w:hAnsi="宋体" w:eastAsia="宋体"/>
+                <w:rFonts w:ascii="微软雅黑" w:hAnsi="微软雅黑" w:eastAsia="微软雅黑" w:cs="微软雅黑"/>
                 <w:sz w:val="20"/>
               </w:rPr>
               <w:t>实测结果</w:t>
@@ -3648,7 +3722,7 @@
           <w:p>
             <w:r>
               <w:rPr>
-                <w:rFonts w:ascii="宋体" w:hAnsi="宋体" w:eastAsia="宋体"/>
+                <w:rFonts w:ascii="微软雅黑" w:hAnsi="微软雅黑" w:eastAsia="微软雅黑" w:cs="微软雅黑"/>
                 <w:sz w:val="18"/>
               </w:rPr>
               <w:t>API-01</w:t>
@@ -3662,7 +3736,7 @@
           <w:p>
             <w:r>
               <w:rPr>
-                <w:rFonts w:ascii="宋体" w:hAnsi="宋体" w:eastAsia="宋体"/>
+                <w:rFonts w:ascii="微软雅黑" w:hAnsi="微软雅黑" w:eastAsia="微软雅黑" w:cs="微软雅黑"/>
                 <w:sz w:val="18"/>
               </w:rPr>
               <w:t>`/ping`</w:t>
@@ -3676,7 +3750,7 @@
           <w:p>
             <w:r>
               <w:rPr>
-                <w:rFonts w:ascii="宋体" w:hAnsi="宋体" w:eastAsia="宋体"/>
+                <w:rFonts w:ascii="微软雅黑" w:hAnsi="微软雅黑" w:eastAsia="微软雅黑" w:cs="微软雅黑"/>
                 <w:sz w:val="18"/>
               </w:rPr>
               <w:t>GET</w:t>
@@ -3690,7 +3764,7 @@
           <w:p>
             <w:r>
               <w:rPr>
-                <w:rFonts w:ascii="宋体" w:hAnsi="宋体" w:eastAsia="宋体"/>
+                <w:rFonts w:ascii="微软雅黑" w:hAnsi="微软雅黑" w:eastAsia="微软雅黑" w:cs="微软雅黑"/>
                 <w:sz w:val="18"/>
               </w:rPr>
               <w:t>存活探测</w:t>
@@ -3704,7 +3778,7 @@
           <w:p>
             <w:r>
               <w:rPr>
-                <w:rFonts w:ascii="宋体" w:hAnsi="宋体" w:eastAsia="宋体"/>
+                <w:rFonts w:ascii="微软雅黑" w:hAnsi="微软雅黑" w:eastAsia="微软雅黑" w:cs="微软雅黑"/>
                 <w:sz w:val="18"/>
               </w:rPr>
               <w:t>`{"ok":true}`</w:t>
@@ -3726,7 +3800,7 @@
           <w:p>
             <w:r>
               <w:rPr>
-                <w:rFonts w:ascii="宋体" w:hAnsi="宋体" w:eastAsia="宋体"/>
+                <w:rFonts w:ascii="微软雅黑" w:hAnsi="微软雅黑" w:eastAsia="微软雅黑" w:cs="微软雅黑"/>
                 <w:sz w:val="18"/>
               </w:rPr>
               <w:t>API-02</w:t>
@@ -3740,7 +3814,7 @@
           <w:p>
             <w:r>
               <w:rPr>
-                <w:rFonts w:ascii="宋体" w:hAnsi="宋体" w:eastAsia="宋体"/>
+                <w:rFonts w:ascii="微软雅黑" w:hAnsi="微软雅黑" w:eastAsia="微软雅黑" w:cs="微软雅黑"/>
                 <w:sz w:val="18"/>
               </w:rPr>
               <w:t>`/api/health`</w:t>
@@ -3754,7 +3828,7 @@
           <w:p>
             <w:r>
               <w:rPr>
-                <w:rFonts w:ascii="宋体" w:hAnsi="宋体" w:eastAsia="宋体"/>
+                <w:rFonts w:ascii="微软雅黑" w:hAnsi="微软雅黑" w:eastAsia="微软雅黑" w:cs="微软雅黑"/>
                 <w:sz w:val="18"/>
               </w:rPr>
               <w:t>GET</w:t>
@@ -3768,7 +3842,7 @@
           <w:p>
             <w:r>
               <w:rPr>
-                <w:rFonts w:ascii="宋体" w:hAnsi="宋体" w:eastAsia="宋体"/>
+                <w:rFonts w:ascii="微软雅黑" w:hAnsi="微软雅黑" w:eastAsia="微软雅黑" w:cs="微软雅黑"/>
                 <w:sz w:val="18"/>
               </w:rPr>
               <w:t>健康检查</w:t>
@@ -3782,7 +3856,7 @@
           <w:p>
             <w:r>
               <w:rPr>
-                <w:rFonts w:ascii="宋体" w:hAnsi="宋体" w:eastAsia="宋体"/>
+                <w:rFonts w:ascii="微软雅黑" w:hAnsi="微软雅黑" w:eastAsia="微软雅黑" w:cs="微软雅黑"/>
                 <w:sz w:val="18"/>
               </w:rPr>
               <w:t>`db`/`redis`/`storage` 字段符合当前环境</w:t>
@@ -3804,7 +3878,7 @@
           <w:p>
             <w:r>
               <w:rPr>
-                <w:rFonts w:ascii="宋体" w:hAnsi="宋体" w:eastAsia="宋体"/>
+                <w:rFonts w:ascii="微软雅黑" w:hAnsi="微软雅黑" w:eastAsia="微软雅黑" w:cs="微软雅黑"/>
                 <w:sz w:val="18"/>
               </w:rPr>
               <w:t>API-03</w:t>
@@ -3818,7 +3892,7 @@
           <w:p>
             <w:r>
               <w:rPr>
-                <w:rFonts w:ascii="宋体" w:hAnsi="宋体" w:eastAsia="宋体"/>
+                <w:rFonts w:ascii="微软雅黑" w:hAnsi="微软雅黑" w:eastAsia="微软雅黑" w:cs="微软雅黑"/>
                 <w:sz w:val="18"/>
               </w:rPr>
               <w:t>`/api/status?task_id=`</w:t>
@@ -3832,7 +3906,7 @@
           <w:p>
             <w:r>
               <w:rPr>
-                <w:rFonts w:ascii="宋体" w:hAnsi="宋体" w:eastAsia="宋体"/>
+                <w:rFonts w:ascii="微软雅黑" w:hAnsi="微软雅黑" w:eastAsia="微软雅黑" w:cs="微软雅黑"/>
                 <w:sz w:val="18"/>
               </w:rPr>
               <w:t>GET</w:t>
@@ -3846,7 +3920,7 @@
           <w:p>
             <w:r>
               <w:rPr>
-                <w:rFonts w:ascii="宋体" w:hAnsi="宋体" w:eastAsia="宋体"/>
+                <w:rFonts w:ascii="微软雅黑" w:hAnsi="微软雅黑" w:eastAsia="微软雅黑" w:cs="微软雅黑"/>
                 <w:sz w:val="18"/>
               </w:rPr>
               <w:t>需 Bearer</w:t>
@@ -3860,7 +3934,7 @@
           <w:p>
             <w:r>
               <w:rPr>
-                <w:rFonts w:ascii="宋体" w:hAnsi="宋体" w:eastAsia="宋体"/>
+                <w:rFonts w:ascii="微软雅黑" w:hAnsi="微软雅黑" w:eastAsia="微软雅黑" w:cs="微软雅黑"/>
                 <w:sz w:val="18"/>
               </w:rPr>
               <w:t>返回任务详情或 404/403 符合权限</w:t>
@@ -3881,6 +3955,11 @@
         <w:pStyle w:val="Heading1"/>
       </w:pPr>
       <w:r>
+        <w:rPr>
+          <w:rFonts w:ascii="黑体" w:hAnsi="黑体" w:eastAsia="黑体" w:cs="黑体"/>
+          <w:b/>
+          <w:sz w:val="28"/>
+        </w:rPr>
         <w:t>4. 缺陷与风险记录</w:t>
       </w:r>
     </w:p>
@@ -3905,7 +3984,7 @@
           <w:p>
             <w:r>
               <w:rPr>
-                <w:rFonts w:ascii="宋体" w:hAnsi="宋体" w:eastAsia="宋体"/>
+                <w:rFonts w:ascii="微软雅黑" w:hAnsi="微软雅黑" w:eastAsia="微软雅黑" w:cs="微软雅黑"/>
                 <w:sz w:val="20"/>
               </w:rPr>
               <w:t>编号</w:t>
@@ -3919,7 +3998,7 @@
           <w:p>
             <w:r>
               <w:rPr>
-                <w:rFonts w:ascii="宋体" w:hAnsi="宋体" w:eastAsia="宋体"/>
+                <w:rFonts w:ascii="微软雅黑" w:hAnsi="微软雅黑" w:eastAsia="微软雅黑" w:cs="微软雅黑"/>
                 <w:sz w:val="20"/>
               </w:rPr>
               <w:t>现象</w:t>
@@ -3933,7 +4012,7 @@
           <w:p>
             <w:r>
               <w:rPr>
-                <w:rFonts w:ascii="宋体" w:hAnsi="宋体" w:eastAsia="宋体"/>
+                <w:rFonts w:ascii="微软雅黑" w:hAnsi="微软雅黑" w:eastAsia="微软雅黑" w:cs="微软雅黑"/>
                 <w:sz w:val="20"/>
               </w:rPr>
               <w:t>严重程度</w:t>
@@ -3947,7 +4026,7 @@
           <w:p>
             <w:r>
               <w:rPr>
-                <w:rFonts w:ascii="宋体" w:hAnsi="宋体" w:eastAsia="宋体"/>
+                <w:rFonts w:ascii="微软雅黑" w:hAnsi="微软雅黑" w:eastAsia="微软雅黑" w:cs="微软雅黑"/>
                 <w:sz w:val="20"/>
               </w:rPr>
               <w:t>状态</w:t>
@@ -3961,7 +4040,7 @@
           <w:p>
             <w:r>
               <w:rPr>
-                <w:rFonts w:ascii="宋体" w:hAnsi="宋体" w:eastAsia="宋体"/>
+                <w:rFonts w:ascii="微软雅黑" w:hAnsi="微软雅黑" w:eastAsia="微软雅黑" w:cs="微软雅黑"/>
                 <w:sz w:val="20"/>
               </w:rPr>
               <w:t>备注</w:t>
@@ -3977,7 +4056,7 @@
           <w:p>
             <w:r>
               <w:rPr>
-                <w:rFonts w:ascii="宋体" w:hAnsi="宋体" w:eastAsia="宋体"/>
+                <w:rFonts w:ascii="微软雅黑" w:hAnsi="微软雅黑" w:eastAsia="微软雅黑" w:cs="微软雅黑"/>
                 <w:sz w:val="18"/>
               </w:rPr>
               <w:t>（示例）</w:t>
@@ -3991,7 +4070,7 @@
           <w:p>
             <w:r>
               <w:rPr>
-                <w:rFonts w:ascii="宋体" w:hAnsi="宋体" w:eastAsia="宋体"/>
+                <w:rFonts w:ascii="微软雅黑" w:hAnsi="微软雅黑" w:eastAsia="微软雅黑" w:cs="微软雅黑"/>
                 <w:sz w:val="18"/>
               </w:rPr>
               <w:t>卡片页白屏</w:t>
@@ -4005,7 +4084,7 @@
           <w:p>
             <w:r>
               <w:rPr>
-                <w:rFonts w:ascii="宋体" w:hAnsi="宋体" w:eastAsia="宋体"/>
+                <w:rFonts w:ascii="微软雅黑" w:hAnsi="微软雅黑" w:eastAsia="微软雅黑" w:cs="微软雅黑"/>
                 <w:sz w:val="18"/>
               </w:rPr>
               <w:t>高</w:t>
@@ -4019,7 +4098,7 @@
           <w:p>
             <w:r>
               <w:rPr>
-                <w:rFonts w:ascii="宋体" w:hAnsi="宋体" w:eastAsia="宋体"/>
+                <w:rFonts w:ascii="微软雅黑" w:hAnsi="微软雅黑" w:eastAsia="微软雅黑" w:cs="微软雅黑"/>
                 <w:sz w:val="18"/>
               </w:rPr>
               <w:t>已修复</w:t>
@@ -4033,7 +4112,7 @@
           <w:p>
             <w:r>
               <w:rPr>
-                <w:rFonts w:ascii="宋体" w:hAnsi="宋体" w:eastAsia="宋体"/>
+                <w:rFonts w:ascii="微软雅黑" w:hAnsi="微软雅黑" w:eastAsia="微软雅黑" w:cs="微软雅黑"/>
                 <w:sz w:val="18"/>
               </w:rPr>
               <w:t>海报相关 Hooks 顺序问题，已通过调整 Hooks 位置修复</w:t>
@@ -4080,6 +4159,11 @@
         <w:pStyle w:val="Heading1"/>
       </w:pPr>
       <w:r>
+        <w:rPr>
+          <w:rFonts w:ascii="黑体" w:hAnsi="黑体" w:eastAsia="黑体" w:cs="黑体"/>
+          <w:b/>
+          <w:sz w:val="28"/>
+        </w:rPr>
         <w:t>5. 测试结论与建议</w:t>
       </w:r>
     </w:p>
@@ -4088,6 +4172,11 @@
         <w:pStyle w:val="Heading2"/>
       </w:pPr>
       <w:r>
+        <w:rPr>
+          <w:rFonts w:ascii="黑体" w:hAnsi="黑体" w:eastAsia="黑体" w:cs="黑体"/>
+          <w:b/>
+          <w:sz w:val="24"/>
+        </w:rPr>
         <w:t>5.1 结论（由执行人填写）</w:t>
       </w:r>
     </w:p>
@@ -4096,6 +4185,10 @@
         <w:pStyle w:val="ListBullet"/>
       </w:pPr>
       <w:r>
+        <w:rPr>
+          <w:rFonts w:ascii="微软雅黑" w:hAnsi="微软雅黑" w:eastAsia="微软雅黑" w:cs="微软雅黑"/>
+          <w:sz w:val="21"/>
+        </w:rPr>
         <w:t>通过用例数：____ / 总用例数：____</w:t>
       </w:r>
     </w:p>
@@ -4104,6 +4197,10 @@
         <w:pStyle w:val="ListBullet"/>
       </w:pPr>
       <w:r>
+        <w:rPr>
+          <w:rFonts w:ascii="微软雅黑" w:hAnsi="微软雅黑" w:eastAsia="微软雅黑" w:cs="微软雅黑"/>
+          <w:sz w:val="21"/>
+        </w:rPr>
         <w:t>是否建议发布/演示：□ 是 □ 否（条件：________）</w:t>
       </w:r>
     </w:p>
@@ -4112,6 +4209,11 @@
         <w:pStyle w:val="Heading2"/>
       </w:pPr>
       <w:r>
+        <w:rPr>
+          <w:rFonts w:ascii="黑体" w:hAnsi="黑体" w:eastAsia="黑体" w:cs="黑体"/>
+          <w:b/>
+          <w:sz w:val="24"/>
+        </w:rPr>
         <w:t>5.2 建议</w:t>
       </w:r>
     </w:p>
@@ -4120,7 +4222,11 @@
         <w:pStyle w:val="ListNumber"/>
       </w:pPr>
       <w:r>
-        <w:t>部署后回归：每次 `docker compose build` 后，至少执行 U-02、R-01、T-02、C-01 作为冒烟测试。</w:t>
+        <w:rPr>
+          <w:rFonts w:ascii="微软雅黑" w:hAnsi="微软雅黑" w:eastAsia="微软雅黑" w:cs="微软雅黑"/>
+          <w:sz w:val="21"/>
+        </w:rPr>
+        <w:t>部署后回归：每次 docker compose build 后，至少执行 U-02、R-01、T-02、C-01 作为冒烟测试。</w:t>
       </w:r>
     </w:p>
     <w:p>
@@ -4128,7 +4234,11 @@
         <w:pStyle w:val="ListNumber"/>
       </w:pPr>
       <w:r>
-        <w:t>密钥与费用：定期检查 DashScope 用量；生产环境勿将 `.env` 提交版本库。</w:t>
+        <w:rPr>
+          <w:rFonts w:ascii="微软雅黑" w:hAnsi="微软雅黑" w:eastAsia="微软雅黑" w:cs="微软雅黑"/>
+          <w:sz w:val="21"/>
+        </w:rPr>
+        <w:t>密钥与费用：定期检查 DashScope 用量；生产环境勿将 .env 提交版本库。</w:t>
       </w:r>
     </w:p>
     <w:p>
@@ -4136,6 +4246,10 @@
         <w:pStyle w:val="ListNumber"/>
       </w:pPr>
       <w:r>
+        <w:rPr>
+          <w:rFonts w:ascii="微软雅黑" w:hAnsi="微软雅黑" w:eastAsia="微软雅黑" w:cs="微软雅黑"/>
+          <w:sz w:val="21"/>
+        </w:rPr>
         <w:t>小程序：正式环境需配置合法 request 域名（HTTPS + 备案），与网页端分开验收。</w:t>
       </w:r>
     </w:p>
@@ -4144,7 +4258,11 @@
         <w:pStyle w:val="ListNumber"/>
       </w:pPr>
       <w:r>
-        <w:t>备份：生产数据库与 `STORAGE_BASE_PATH` 挂载卷建议制定备份策略。</w:t>
+        <w:rPr>
+          <w:rFonts w:ascii="微软雅黑" w:hAnsi="微软雅黑" w:eastAsia="微软雅黑" w:cs="微软雅黑"/>
+          <w:sz w:val="21"/>
+        </w:rPr>
+        <w:t>备份：生产数据库与 STORAGE_BASE_PATH 挂载卷建议制定备份策略。</w:t>
       </w:r>
     </w:p>
     <w:p>
@@ -4152,6 +4270,11 @@
         <w:pStyle w:val="Heading1"/>
       </w:pPr>
       <w:r>
+        <w:rPr>
+          <w:rFonts w:ascii="黑体" w:hAnsi="黑体" w:eastAsia="黑体" w:cs="黑体"/>
+          <w:b/>
+          <w:sz w:val="28"/>
+        </w:rPr>
         <w:t>6. 附录：相关文档与仓库</w:t>
       </w:r>
     </w:p>
@@ -4160,7 +4283,11 @@
         <w:pStyle w:val="ListBullet"/>
       </w:pPr>
       <w:r>
-        <w:t>项目仓库：`https://github.com/zkrispg/echomie`（以实际为准）</w:t>
+        <w:rPr>
+          <w:rFonts w:ascii="微软雅黑" w:hAnsi="微软雅黑" w:eastAsia="微软雅黑" w:cs="微软雅黑"/>
+          <w:sz w:val="21"/>
+        </w:rPr>
+        <w:t>项目仓库：https://github.com/zkrispg/echomie（以实际为准）</w:t>
       </w:r>
     </w:p>
     <w:p>
@@ -4168,7 +4295,11 @@
         <w:pStyle w:val="ListBullet"/>
       </w:pPr>
       <w:r>
-        <w:t>部署说明：参见仓库内 `README.md` 或团队内部运维文档</w:t>
+        <w:rPr>
+          <w:rFonts w:ascii="微软雅黑" w:hAnsi="微软雅黑" w:eastAsia="微软雅黑" w:cs="微软雅黑"/>
+          <w:sz w:val="21"/>
+        </w:rPr>
+        <w:t>部署说明：参见仓库内 README.md 或团队内部运维文档</w:t>
       </w:r>
     </w:p>
     <w:p>
@@ -4176,13 +4307,19 @@
         <w:pStyle w:val="ListBullet"/>
       </w:pPr>
       <w:r>
-        <w:t>本报告路径：`docs/EchoMie-测试报告.md`</w:t>
+        <w:rPr>
+          <w:rFonts w:ascii="微软雅黑" w:hAnsi="微软雅黑" w:eastAsia="微软雅黑" w:cs="微软雅黑"/>
+          <w:sz w:val="21"/>
+        </w:rPr>
+        <w:t>本报告路径：docs/EchoMie-测试报告.md</w:t>
       </w:r>
     </w:p>
     <w:p>
       <w:r>
         <w:rPr>
+          <w:rFonts w:ascii="微软雅黑" w:hAnsi="微软雅黑" w:eastAsia="微软雅黑" w:cs="微软雅黑"/>
           <w:b/>
+          <w:sz w:val="21"/>
         </w:rPr>
         <w:t>签字 / 日期（可选）</w:t>
       </w:r>
@@ -4206,7 +4343,7 @@
           <w:p>
             <w:r>
               <w:rPr>
-                <w:rFonts w:ascii="宋体" w:hAnsi="宋体" w:eastAsia="宋体"/>
+                <w:rFonts w:ascii="微软雅黑" w:hAnsi="微软雅黑" w:eastAsia="微软雅黑" w:cs="微软雅黑"/>
                 <w:sz w:val="20"/>
               </w:rPr>
               <w:t>角色</w:t>
@@ -4220,7 +4357,7 @@
           <w:p>
             <w:r>
               <w:rPr>
-                <w:rFonts w:ascii="宋体" w:hAnsi="宋体" w:eastAsia="宋体"/>
+                <w:rFonts w:ascii="微软雅黑" w:hAnsi="微软雅黑" w:eastAsia="微软雅黑" w:cs="微软雅黑"/>
                 <w:sz w:val="20"/>
               </w:rPr>
               <w:t>姓名</w:t>
@@ -4234,7 +4371,7 @@
           <w:p>
             <w:r>
               <w:rPr>
-                <w:rFonts w:ascii="宋体" w:hAnsi="宋体" w:eastAsia="宋体"/>
+                <w:rFonts w:ascii="微软雅黑" w:hAnsi="微软雅黑" w:eastAsia="微软雅黑" w:cs="微软雅黑"/>
                 <w:sz w:val="20"/>
               </w:rPr>
               <w:t>日期</w:t>
@@ -4250,7 +4387,7 @@
           <w:p>
             <w:r>
               <w:rPr>
-                <w:rFonts w:ascii="宋体" w:hAnsi="宋体" w:eastAsia="宋体"/>
+                <w:rFonts w:ascii="微软雅黑" w:hAnsi="微软雅黑" w:eastAsia="微软雅黑" w:cs="微软雅黑"/>
                 <w:sz w:val="18"/>
               </w:rPr>
               <w:t>测试执行</w:t>
@@ -4278,7 +4415,7 @@
           <w:p>
             <w:r>
               <w:rPr>
-                <w:rFonts w:ascii="宋体" w:hAnsi="宋体" w:eastAsia="宋体"/>
+                <w:rFonts w:ascii="微软雅黑" w:hAnsi="微软雅黑" w:eastAsia="微软雅黑" w:cs="微软雅黑"/>
                 <w:sz w:val="18"/>
               </w:rPr>
               <w:t>项目负责人</w:t>
@@ -4673,6 +4810,10 @@
     <w:name w:val="Normal"/>
     <w:qFormat/>
     <w:rsid w:val="00FC693F"/>
+    <w:rPr>
+      <w:rFonts w:ascii="微软雅黑" w:hAnsi="微软雅黑" w:eastAsia="微软雅黑" w:cs="微软雅黑"/>
+      <w:sz w:val="21"/>
+    </w:rPr>
   </w:style>
   <w:style w:type="paragraph" w:styleId="Header">
     <w:name w:val="header"/>
@@ -4733,7 +4874,7 @@
       <w:outlineLvl w:val="0"/>
     </w:pPr>
     <w:rPr>
-      <w:rFonts w:asciiTheme="majorHAnsi" w:eastAsiaTheme="majorEastAsia" w:hAnsiTheme="majorHAnsi" w:cstheme="majorBidi"/>
+      <w:rFonts w:asciiTheme="majorHAnsi" w:eastAsiaTheme="majorEastAsia" w:hAnsiTheme="majorHAnsi" w:cstheme="majorBidi" w:ascii="黑体" w:hAnsi="黑体" w:eastAsia="黑体" w:cs="黑体"/>
       <w:b/>
       <w:bCs/>
       <w:color w:val="365F91" w:themeColor="accent1" w:themeShade="BF"/>
@@ -4757,7 +4898,7 @@
       <w:outlineLvl w:val="1"/>
     </w:pPr>
     <w:rPr>
-      <w:rFonts w:asciiTheme="majorHAnsi" w:eastAsiaTheme="majorEastAsia" w:hAnsiTheme="majorHAnsi" w:cstheme="majorBidi"/>
+      <w:rFonts w:asciiTheme="majorHAnsi" w:eastAsiaTheme="majorEastAsia" w:hAnsiTheme="majorHAnsi" w:cstheme="majorBidi" w:ascii="黑体" w:hAnsi="黑体" w:eastAsia="黑体" w:cs="黑体"/>
       <w:b/>
       <w:bCs/>
       <w:color w:val="4F81BD" w:themeColor="accent1"/>
@@ -4781,7 +4922,7 @@
       <w:outlineLvl w:val="2"/>
     </w:pPr>
     <w:rPr>
-      <w:rFonts w:asciiTheme="majorHAnsi" w:eastAsiaTheme="majorEastAsia" w:hAnsiTheme="majorHAnsi" w:cstheme="majorBidi"/>
+      <w:rFonts w:asciiTheme="majorHAnsi" w:eastAsiaTheme="majorEastAsia" w:hAnsiTheme="majorHAnsi" w:cstheme="majorBidi" w:ascii="黑体" w:hAnsi="黑体" w:eastAsia="黑体" w:cs="黑体"/>
       <w:b/>
       <w:bCs/>
       <w:color w:val="4F81BD" w:themeColor="accent1"/>
@@ -5094,6 +5235,10 @@
       <w:ind w:left="720"/>
       <w:contextualSpacing/>
     </w:pPr>
+    <w:rPr>
+      <w:rFonts w:ascii="微软雅黑" w:hAnsi="微软雅黑" w:eastAsia="微软雅黑" w:cs="微软雅黑"/>
+      <w:sz w:val="21"/>
+    </w:rPr>
   </w:style>
   <w:style w:type="paragraph" w:styleId="BodyText">
     <w:name w:val="Body Text"/>
@@ -5202,6 +5347,10 @@
       </w:numPr>
       <w:contextualSpacing/>
     </w:pPr>
+    <w:rPr>
+      <w:rFonts w:ascii="微软雅黑" w:hAnsi="微软雅黑" w:eastAsia="微软雅黑" w:cs="微软雅黑"/>
+      <w:sz w:val="21"/>
+    </w:rPr>
   </w:style>
   <w:style w:type="paragraph" w:styleId="ListBullet2">
     <w:name w:val="List Bullet 2"/>
@@ -5241,6 +5390,10 @@
       </w:numPr>
       <w:contextualSpacing/>
     </w:pPr>
+    <w:rPr>
+      <w:rFonts w:ascii="微软雅黑" w:hAnsi="微软雅黑" w:eastAsia="微软雅黑" w:cs="微软雅黑"/>
+      <w:sz w:val="21"/>
+    </w:rPr>
   </w:style>
   <w:style w:type="paragraph" w:styleId="ListNumber2">
     <w:name w:val="List Number 2"/>

</xml_diff>